<commit_message>
C500: replace courseware with the non-WSQ edition of TGS-2024052081
Replaces the previous self-built C500 set (4 labs, v1.0 deck/LP/LG,
1-day) with the courseware of the WSQ parent "Automate Video and Voice
AI Agents with n8n" (TGS-2024052081, v4.0), converted to non-WSQ:

- deck v2.0 (108 slides): WSQ attendance, Learning Outcomes and
  assessment slides removed; TRAQOM slide rewritten as Course Feedback
- LP/LG: retimed to 2 days, 9:30am-5:30pm, 7.5 h/day (30-min lunch),
  same 3 topics and 12 labs; assessment, K/A statements and WSQ skill
  framing removed
- labs_local_n8n/ + labs_remote_n8n/ copied from the parent; funding
  facts removed from the Lab 8 persona prompt
- README rewritten for the non-WSQ course

Co-Authored-By: Claude Opus 5.5 <noreply@anthropic.com>
</commit_message>
<xml_diff>
--- a/courseware/LP-Voice and Video Agents with n8n (C500).docx
+++ b/courseware/LP-Voice and Video Agents with n8n (C500).docx
@@ -100,6 +100,45 @@
     </w:p>
     <w:p>
       <w:pPr>
+        <w:jc w:val="center"/>
+      </w:pPr>
+      <w:r>
+        <w:drawing>
+          <wp:inline xmlns:a="http://schemas.openxmlformats.org/drawingml/2006/main" xmlns:pic="http://schemas.openxmlformats.org/drawingml/2006/picture">
+            <wp:extent cx="914400" cy="914400"/>
+            <wp:docPr id="2" name="Picture 2"/>
+            <wp:cNvGraphicFramePr>
+              <a:graphicFrameLocks noChangeAspect="1"/>
+            </wp:cNvGraphicFramePr>
+            <a:graphic>
+              <a:graphicData uri="http://schemas.openxmlformats.org/drawingml/2006/picture">
+                <pic:pic>
+                  <pic:nvPicPr>
+                    <pic:cNvPr id="0" name="n8n-course-logo.png"/>
+                    <pic:cNvPicPr/>
+                  </pic:nvPicPr>
+                  <pic:blipFill>
+                    <a:blip r:embed="rId10"/>
+                    <a:stretch>
+                      <a:fillRect/>
+                    </a:stretch>
+                  </pic:blipFill>
+                  <pic:spPr>
+                    <a:xfrm>
+                      <a:off x="0" y="0"/>
+                      <a:ext cx="914400" cy="914400"/>
+                    </a:xfrm>
+                    <a:prstGeom prst="rect"/>
+                  </pic:spPr>
+                </pic:pic>
+              </a:graphicData>
+            </a:graphic>
+          </wp:inline>
+        </w:drawing>
+      </w:r>
+    </w:p>
+    <w:p>
+      <w:pPr>
         <w:spacing w:before="80" w:after="40"/>
         <w:jc w:val="center"/>
       </w:pPr>
@@ -109,7 +148,7 @@
           <w:color w:val="111827"/>
           <w:sz w:val="40"/>
         </w:rPr>
-        <w:t>Voice and Video Agents with n8n (C500)</w:t>
+        <w:t>Voice and Video Agents with n8n</w:t>
       </w:r>
     </w:p>
     <w:p>
@@ -179,7 +218,7 @@
           <w:color w:val="1F6FEB"/>
           <w:sz w:val="24"/>
         </w:rPr>
-        <w:t>Version 1.0</w:t>
+        <w:t>Version v2.0</w:t>
       </w:r>
     </w:p>
     <w:p>
@@ -289,12 +328,13 @@
             <w:tcW w:type="dxa" w:w="2160"/>
           </w:tcPr>
           <w:p>
-            <w:r/>
+            <w:r>
+              <w:t>v2.0</w:t>
+            </w:r>
             <w:r>
               <w:rPr>
                 <w:sz w:val="19"/>
               </w:rPr>
-              <w:t>1.0</w:t>
             </w:r>
           </w:p>
         </w:tc>
@@ -303,12 +343,13 @@
             <w:tcW w:type="dxa" w:w="2160"/>
           </w:tcPr>
           <w:p>
-            <w:r/>
+            <w:r>
+              <w:t>4 October 2026</w:t>
+            </w:r>
             <w:r>
               <w:rPr>
                 <w:sz w:val="19"/>
               </w:rPr>
-              <w:t>11 August 2026</w:t>
             </w:r>
           </w:p>
         </w:tc>
@@ -317,12 +358,13 @@
             <w:tcW w:type="dxa" w:w="2160"/>
           </w:tcPr>
           <w:p>
-            <w:r/>
+            <w:r>
+              <w:t>Two-day edition: 9:30am - 5:30pm, 7.5 instructional hours a day, same three topics and twelve labs; no assessment.</w:t>
+            </w:r>
             <w:r>
               <w:rPr>
                 <w:sz w:val="19"/>
               </w:rPr>
-              <w:t>Initial aligned release: concept-first PPT, Learner Guide, Lesson Plan and four connected labs.</w:t>
             </w:r>
           </w:p>
         </w:tc>
@@ -331,12 +373,13 @@
             <w:tcW w:type="dxa" w:w="2160"/>
           </w:tcPr>
           <w:p>
-            <w:r/>
+            <w:r>
+              <w:t>Dr Alfred Ang</w:t>
+            </w:r>
             <w:r>
               <w:rPr>
                 <w:sz w:val="19"/>
               </w:rPr>
-              <w:t>Tertiary Infotech Academy Training Team</w:t>
             </w:r>
           </w:p>
         </w:tc>
@@ -348,16 +391,23 @@
       </w:r>
     </w:p>
     <w:p>
-      <w:pPr>
-        <w:spacing w:after="120"/>
-      </w:pPr>
       <w:r>
         <w:rPr>
           <w:b/>
-          <w:color w:val="111827"/>
           <w:sz w:val="24"/>
         </w:rPr>
         <w:t>TABLE OF CONTENTS</w:t>
+      </w:r>
+    </w:p>
+    <w:p>
+      <w:r>
+        <w:fldChar w:fldCharType="begin"/>
+      </w:r>
+      <w:r>
+        <w:instrText xml:space="preserve">TOC \o "1-3" \h \z \u</w:instrText>
+      </w:r>
+      <w:r>
+        <w:fldChar w:fldCharType="separate"/>
       </w:r>
     </w:p>
     <w:p>
@@ -365,16 +415,15 @@
         <w:tabs>
           <w:tab w:pos="9072" w:val="right" w:leader="dot"/>
         </w:tabs>
-        <w:spacing w:after="60"/>
+        <w:spacing w:after="40"/>
+        <w:ind w:left="360"/>
       </w:pPr>
       <w:r>
         <w:rPr>
-          <w:rFonts w:ascii="Arial" w:hAnsi="Arial"/>
-          <w:b/>
-          <w:color w:val="333333"/>
-          <w:sz w:val="22"/>
+          <w:b w:val="0"/>
+          <w:sz w:val="20"/>
         </w:rPr>
-        <w:t>Course Information</w:t>
+        <w:t>Course profile</w:t>
         <w:tab/>
         <w:t>4</w:t>
       </w:r>
@@ -384,16 +433,15 @@
         <w:tabs>
           <w:tab w:pos="9072" w:val="right" w:leader="dot"/>
         </w:tabs>
-        <w:spacing w:after="60"/>
+        <w:spacing w:after="40"/>
+        <w:ind w:left="360"/>
       </w:pPr>
       <w:r>
         <w:rPr>
-          <w:rFonts w:ascii="Arial" w:hAnsi="Arial"/>
-          <w:b/>
-          <w:color w:val="333333"/>
-          <w:sz w:val="22"/>
+          <w:b w:val="0"/>
+          <w:sz w:val="20"/>
         </w:rPr>
-        <w:t>Learning Outcomes</w:t>
+        <w:t>Trainer strategy</w:t>
         <w:tab/>
         <w:t>4</w:t>
       </w:r>
@@ -403,16 +451,15 @@
         <w:tabs>
           <w:tab w:pos="9072" w:val="right" w:leader="dot"/>
         </w:tabs>
-        <w:spacing w:after="60"/>
+        <w:spacing w:after="40"/>
+        <w:ind w:left="360"/>
       </w:pPr>
       <w:r>
         <w:rPr>
-          <w:rFonts w:ascii="Arial" w:hAnsi="Arial"/>
-          <w:b/>
-          <w:color w:val="333333"/>
-          <w:sz w:val="22"/>
+          <w:b w:val="0"/>
+          <w:sz w:val="20"/>
         </w:rPr>
-        <w:t>Learning Reinforcement</w:t>
+        <w:t>Topic map</w:t>
         <w:tab/>
         <w:t>4</w:t>
       </w:r>
@@ -422,18 +469,17 @@
         <w:tabs>
           <w:tab w:pos="9072" w:val="right" w:leader="dot"/>
         </w:tabs>
-        <w:spacing w:after="60"/>
+        <w:spacing w:after="40"/>
+        <w:ind w:left="360"/>
       </w:pPr>
       <w:r>
         <w:rPr>
-          <w:rFonts w:ascii="Arial" w:hAnsi="Arial"/>
-          <w:b/>
-          <w:color w:val="333333"/>
-          <w:sz w:val="22"/>
+          <w:b w:val="0"/>
+          <w:sz w:val="20"/>
         </w:rPr>
-        <w:t>Course Schedule</w:t>
+        <w:t>Daily schedule</w:t>
         <w:tab/>
-        <w:t>4</w:t>
+        <w:t>5</w:t>
       </w:r>
     </w:p>
     <w:p>
@@ -441,19 +487,17 @@
         <w:tabs>
           <w:tab w:pos="9072" w:val="right" w:leader="dot"/>
         </w:tabs>
-        <w:spacing w:after="60"/>
-        <w:ind w:left="432"/>
+        <w:spacing w:after="40"/>
+        <w:ind w:left="720"/>
       </w:pPr>
       <w:r>
         <w:rPr>
-          <w:rFonts w:ascii="Arial" w:hAnsi="Arial"/>
           <w:b w:val="0"/>
-          <w:color w:val="333333"/>
-          <w:sz w:val="21"/>
+          <w:sz w:val="20"/>
         </w:rPr>
-        <w:t>Day 1 — Build and govern voice and avatar-video agents with n8n</w:t>
+        <w:t>Day 1</w:t>
         <w:tab/>
-        <w:t>4</w:t>
+        <w:t>5</w:t>
       </w:r>
     </w:p>
     <w:p>
@@ -461,18 +505,40 @@
         <w:tabs>
           <w:tab w:pos="9072" w:val="right" w:leader="dot"/>
         </w:tabs>
-        <w:spacing w:after="60"/>
+        <w:spacing w:after="40"/>
+        <w:ind w:left="720"/>
       </w:pPr>
       <w:r>
         <w:rPr>
-          <w:rFonts w:ascii="Arial" w:hAnsi="Arial"/>
-          <w:b/>
-          <w:color w:val="333333"/>
-          <w:sz w:val="22"/>
+          <w:b w:val="0"/>
+          <w:sz w:val="20"/>
         </w:rPr>
-        <w:t>Lab Reference (aligned to course topics)</w:t>
+        <w:t>Day 2</w:t>
         <w:tab/>
-        <w:t>5</w:t>
+        <w:t>7</w:t>
+      </w:r>
+    </w:p>
+    <w:p>
+      <w:pPr>
+        <w:tabs>
+          <w:tab w:pos="9072" w:val="right" w:leader="dot"/>
+        </w:tabs>
+        <w:spacing w:after="40"/>
+        <w:ind w:left="360"/>
+      </w:pPr>
+      <w:r>
+        <w:rPr>
+          <w:b w:val="0"/>
+          <w:sz w:val="20"/>
+        </w:rPr>
+        <w:t>Evidence the trainer collects</w:t>
+        <w:tab/>
+        <w:t>9</w:t>
+      </w:r>
+    </w:p>
+    <w:p>
+      <w:r>
+        <w:fldChar w:fldCharType="end"/>
       </w:r>
     </w:p>
     <w:p>
@@ -485,12 +551,13 @@
         <w:pStyle w:val="Heading1"/>
       </w:pPr>
       <w:r>
-        <w:t>Course Information</w:t>
+        <w:t>Course profile</w:t>
       </w:r>
     </w:p>
+    <w:p/>
     <w:tbl>
       <w:tblPr>
-        <w:tblStyle w:val="TableGrid"/>
+        <w:tblStyle w:val="LightGrid-Accent1"/>
         <w:tblW w:type="auto" w:w="0"/>
         <w:tblLook w:firstColumn="1" w:firstRow="1" w:lastColumn="0" w:lastRow="0" w:noHBand="0" w:noVBand="1" w:val="04A0"/>
       </w:tblPr>
@@ -502,16 +569,10 @@
         <w:tc>
           <w:tcPr>
             <w:tcW w:type="dxa" w:w="4320"/>
-            <w:shd w:val="clear" w:color="auto" w:fill="E8F0FE"/>
           </w:tcPr>
           <w:p>
-            <w:r/>
             <w:r>
-              <w:rPr>
-                <w:b/>
-                <w:sz w:val="20"/>
-              </w:rPr>
-              <w:t>Course Title</w:t>
+              <w:t>Provider</w:t>
             </w:r>
           </w:p>
         </w:tc>
@@ -520,12 +581,8 @@
             <w:tcW w:type="dxa" w:w="4320"/>
           </w:tcPr>
           <w:p>
-            <w:r/>
             <w:r>
-              <w:rPr>
-                <w:sz w:val="20"/>
-              </w:rPr>
-              <w:t>Voice and Video Agents with n8n (C500)</w:t>
+              <w:t>Tertiary Infotech Academy Pte Ltd</w:t>
             </w:r>
           </w:p>
         </w:tc>
@@ -534,16 +591,10 @@
         <w:tc>
           <w:tcPr>
             <w:tcW w:type="dxa" w:w="4320"/>
-            <w:shd w:val="clear" w:color="auto" w:fill="E8F0FE"/>
           </w:tcPr>
           <w:p>
-            <w:r/>
             <w:r>
-              <w:rPr>
-                <w:b/>
-                <w:sz w:val="20"/>
-              </w:rPr>
-              <w:t>Course Reference</w:t>
+              <w:t>Course code</w:t>
             </w:r>
           </w:p>
         </w:tc>
@@ -552,11 +603,7 @@
             <w:tcW w:type="dxa" w:w="4320"/>
           </w:tcPr>
           <w:p>
-            <w:r/>
             <w:r>
-              <w:rPr>
-                <w:sz w:val="20"/>
-              </w:rPr>
               <w:t>C500</w:t>
             </w:r>
           </w:p>
@@ -566,16 +613,10 @@
         <w:tc>
           <w:tcPr>
             <w:tcW w:type="dxa" w:w="4320"/>
-            <w:shd w:val="clear" w:color="auto" w:fill="E8F0FE"/>
           </w:tcPr>
           <w:p>
-            <w:r/>
             <w:r>
-              <w:rPr>
-                <w:b/>
-                <w:sz w:val="20"/>
-              </w:rPr>
-              <w:t>Training Provider</w:t>
+              <w:t>Version</w:t>
             </w:r>
           </w:p>
         </w:tc>
@@ -584,12 +625,8 @@
             <w:tcW w:type="dxa" w:w="4320"/>
           </w:tcPr>
           <w:p>
-            <w:r/>
             <w:r>
-              <w:rPr>
-                <w:sz w:val="20"/>
-              </w:rPr>
-              <w:t>Tertiary Infotech Academy Pte Ltd  (UEN 201200696W)</w:t>
+              <w:t>v2.0 (4 October 2026)</w:t>
             </w:r>
           </w:p>
         </w:tc>
@@ -598,15 +635,31 @@
         <w:tc>
           <w:tcPr>
             <w:tcW w:type="dxa" w:w="4320"/>
-            <w:shd w:val="clear" w:color="auto" w:fill="E8F0FE"/>
           </w:tcPr>
           <w:p>
-            <w:r/>
             <w:r>
-              <w:rPr>
-                <w:b/>
-                <w:sz w:val="20"/>
-              </w:rPr>
+              <w:t>Mode</w:t>
+            </w:r>
+          </w:p>
+        </w:tc>
+        <w:tc>
+          <w:tcPr>
+            <w:tcW w:type="dxa" w:w="4320"/>
+          </w:tcPr>
+          <w:p>
+            <w:r>
+              <w:t>Instructor-led adult training, hands-on labs</w:t>
+            </w:r>
+          </w:p>
+        </w:tc>
+      </w:tr>
+      <w:tr>
+        <w:tc>
+          <w:tcPr>
+            <w:tcW w:type="dxa" w:w="4320"/>
+          </w:tcPr>
+          <w:p>
+            <w:r>
               <w:t>Duration</w:t>
             </w:r>
           </w:p>
@@ -616,12 +669,8 @@
             <w:tcW w:type="dxa" w:w="4320"/>
           </w:tcPr>
           <w:p>
-            <w:r/>
             <w:r>
-              <w:rPr>
-                <w:sz w:val="20"/>
-              </w:rPr>
-              <w:t>1 day · 8 scheduled hours per day (8 hours)</w:t>
+              <w:t>2 days, 7.5 instructional hours each (9:30am - 5:30pm)</w:t>
             </w:r>
           </w:p>
         </w:tc>
@@ -630,16 +679,10 @@
         <w:tc>
           <w:tcPr>
             <w:tcW w:type="dxa" w:w="4320"/>
-            <w:shd w:val="clear" w:color="auto" w:fill="E8F0FE"/>
           </w:tcPr>
           <w:p>
-            <w:r/>
             <w:r>
-              <w:rPr>
-                <w:b/>
-                <w:sz w:val="20"/>
-              </w:rPr>
-              <w:t>Daily Timing</w:t>
+              <w:t>Practical ratio</w:t>
             </w:r>
           </w:p>
         </w:tc>
@@ -648,12 +691,8 @@
             <w:tcW w:type="dxa" w:w="4320"/>
           </w:tcPr>
           <w:p>
-            <w:r/>
             <w:r>
-              <w:rPr>
-                <w:sz w:val="20"/>
-              </w:rPr>
-              <w:t>9:00 am - 6:00 pm (1-hour lunch; tea breaks within scheduled time)</w:t>
+              <w:t>At least 70 percent hands-on lab time</w:t>
             </w:r>
           </w:p>
         </w:tc>
@@ -662,47 +701,9 @@
         <w:tc>
           <w:tcPr>
             <w:tcW w:type="dxa" w:w="4320"/>
-            <w:shd w:val="clear" w:color="auto" w:fill="E8F0FE"/>
           </w:tcPr>
           <w:p>
-            <w:r/>
             <w:r>
-              <w:rPr>
-                <w:b/>
-                <w:sz w:val="20"/>
-              </w:rPr>
-              <w:t>Mode</w:t>
-            </w:r>
-          </w:p>
-        </w:tc>
-        <w:tc>
-          <w:tcPr>
-            <w:tcW w:type="dxa" w:w="4320"/>
-          </w:tcPr>
-          <w:p>
-            <w:r/>
-            <w:r>
-              <w:rPr>
-                <w:sz w:val="20"/>
-              </w:rPr>
-              <w:t>Instructor-led, concept-first demonstrations and connected hands-on labs</w:t>
-            </w:r>
-          </w:p>
-        </w:tc>
-      </w:tr>
-      <w:tr>
-        <w:tc>
-          <w:tcPr>
-            <w:tcW w:type="dxa" w:w="4320"/>
-            <w:shd w:val="clear" w:color="auto" w:fill="E8F0FE"/>
-          </w:tcPr>
-          <w:p>
-            <w:r/>
-            <w:r>
-              <w:rPr>
-                <w:b/>
-                <w:sz w:val="20"/>
-              </w:rPr>
               <w:t>Trainer</w:t>
             </w:r>
           </w:p>
@@ -712,1181 +713,99 @@
             <w:tcW w:type="dxa" w:w="4320"/>
           </w:tcPr>
           <w:p>
-            <w:r/>
             <w:r>
-              <w:rPr>
-                <w:sz w:val="20"/>
-              </w:rPr>
-              <w:t>Tertiary Infotech Academy Training Team</w:t>
+              <w:t>Dr Alfred Ang</w:t>
             </w:r>
           </w:p>
         </w:tc>
       </w:tr>
     </w:tbl>
+    <w:p/>
     <w:p>
       <w:pPr>
         <w:pStyle w:val="Heading1"/>
       </w:pPr>
       <w:r>
-        <w:t>Learning Outcomes</w:t>
+        <w:t>Trainer strategy</w:t>
       </w:r>
     </w:p>
+    <w:p/>
     <w:p>
       <w:r>
-        <w:t>On completion of this course, learners will be able to:</w:t>
+        <w:t>Demonstrate each concept with one small working example, then move quickly into learner practice. For every lab, ask learners to show the evidence - the n8n execution trace, the generated media, the call transcript, the scorecard. Do not accept a screenshot of a finished screen as proof that the workflow is correct: a fluent output and a correct workflow are not the same thing, and telling them apart is the skill this course teaches.</w:t>
       </w:r>
     </w:p>
-    <w:p>
-      <w:pPr>
-        <w:pStyle w:val="ListBullet"/>
-      </w:pPr>
-      <w:r>
-        <w:rPr>
-          <w:sz w:val="21"/>
-        </w:rPr>
-        <w:t>LO1: Explain the listen-think-talk architecture of a voice agent, select suitable business use cases, and design the n8n workflow and channel boundary.</w:t>
-      </w:r>
-    </w:p>
-    <w:p>
-      <w:pPr>
-        <w:pStyle w:val="ListBullet"/>
-      </w:pPr>
-      <w:r>
-        <w:rPr>
-          <w:sz w:val="21"/>
-        </w:rPr>
-        <w:t>LO2: Build and verify an n8n voice agent that transcribes audio with Whisper, reasons with an AI Agent, speaks with ElevenLabs, and operates through browser and chat channels.</w:t>
-      </w:r>
-    </w:p>
-    <w:p>
-      <w:pPr>
-        <w:pStyle w:val="ListBullet"/>
-      </w:pPr>
-      <w:r>
-        <w:rPr>
-          <w:sz w:val="21"/>
-        </w:rPr>
-        <w:t>LO3: Explain avatar-video architecture and build an n8n workflow that turns a governed brief into a talking-head video through an asynchronous video API.</w:t>
-      </w:r>
-    </w:p>
-    <w:p>
-      <w:pPr>
-        <w:pStyle w:val="ListBullet"/>
-      </w:pPr>
-      <w:r>
-        <w:rPr>
-          <w:sz w:val="21"/>
-        </w:rPr>
-        <w:t>LO4: Automate a monitored video-production and distribution pipeline with approval, retry, accessibility, privacy, cost and human-handoff controls.</w:t>
-      </w:r>
-    </w:p>
+    <w:p/>
     <w:p>
       <w:pPr>
         <w:pStyle w:val="Heading1"/>
       </w:pPr>
       <w:r>
-        <w:t>Learning Reinforcement</w:t>
+        <w:t>Topic map</w:t>
       </w:r>
     </w:p>
-    <w:p>
-      <w:pPr>
-        <w:pStyle w:val="ListBullet"/>
-      </w:pPr>
-      <w:r>
-        <w:rPr>
-          <w:sz w:val="21"/>
-        </w:rPr>
-        <w:t>Every topic is followed by hands-on labs that learners complete on their own machine.</w:t>
-      </w:r>
-    </w:p>
-    <w:p>
-      <w:pPr>
-        <w:pStyle w:val="ListBullet"/>
-      </w:pPr>
-      <w:r>
-        <w:rPr>
-          <w:sz w:val="21"/>
-        </w:rPr>
-        <w:t>Each lab ends with a 'Test it' verification step so learners can confirm their own progress.</w:t>
-      </w:r>
-    </w:p>
-    <w:p>
-      <w:pPr>
-        <w:pStyle w:val="ListBullet"/>
-      </w:pPr>
-      <w:r>
-        <w:rPr>
-          <w:sz w:val="21"/>
-        </w:rPr>
-        <w:t>The trainer circulates during lab time to give individual feedback and unblock learners.</w:t>
-      </w:r>
-    </w:p>
-    <w:p>
-      <w:pPr>
-        <w:pStyle w:val="ListBullet"/>
-      </w:pPr>
-      <w:r>
-        <w:rPr>
-          <w:sz w:val="21"/>
-        </w:rPr>
-        <w:t>Each topic closes with a recap mapped back to the course learning outcomes.</w:t>
-      </w:r>
-    </w:p>
-    <w:p>
-      <w:pPr>
-        <w:pStyle w:val="Heading1"/>
-      </w:pPr>
-      <w:r>
-        <w:t>Course Schedule</w:t>
-      </w:r>
-    </w:p>
-    <w:p>
-      <w:pPr>
-        <w:pStyle w:val="Heading2"/>
-      </w:pPr>
-      <w:r>
-        <w:t>Day 1 — Build and govern voice and avatar-video agents with n8n</w:t>
-      </w:r>
-    </w:p>
+    <w:p/>
+    <w:p/>
     <w:tbl>
       <w:tblPr>
-        <w:tblStyle w:val="TableGrid"/>
+        <w:tblStyle w:val="LightGrid-Accent1"/>
         <w:tblW w:type="auto" w:w="0"/>
-        <w:jc w:val="center"/>
         <w:tblLook w:firstColumn="1" w:firstRow="1" w:lastColumn="0" w:lastRow="0" w:noHBand="0" w:noVBand="1" w:val="04A0"/>
       </w:tblPr>
       <w:tblGrid>
-        <w:gridCol w:w="2880"/>
-        <w:gridCol w:w="2880"/>
-        <w:gridCol w:w="2880"/>
+        <w:gridCol w:w="1728"/>
+        <w:gridCol w:w="1728"/>
+        <w:gridCol w:w="1728"/>
+        <w:gridCol w:w="1728"/>
+        <w:gridCol w:w="1728"/>
       </w:tblGrid>
       <w:tr>
-        <w:trPr>
-          <w:tblHeader w:val="true"/>
-        </w:trPr>
         <w:tc>
           <w:tcPr>
-            <w:tcW w:type="dxa" w:w="1656"/>
-            <w:shd w:val="clear" w:color="auto" w:fill="1F6FEB"/>
+            <w:tcW w:type="dxa" w:w="1728"/>
           </w:tcPr>
           <w:p>
-            <w:r/>
             <w:r>
-              <w:rPr>
-                <w:rFonts w:ascii="Arial" w:hAnsi="Arial"/>
-                <w:b/>
-                <w:color w:val="FFFFFF"/>
-                <w:sz w:val="20"/>
-              </w:rPr>
-              <w:t>Time</w:t>
+              <w:t>Session</w:t>
             </w:r>
           </w:p>
         </w:tc>
         <w:tc>
           <w:tcPr>
-            <w:tcW w:type="dxa" w:w="1296"/>
-            <w:shd w:val="clear" w:color="auto" w:fill="1F6FEB"/>
+            <w:tcW w:type="dxa" w:w="1728"/>
           </w:tcPr>
           <w:p>
-            <w:r/>
             <w:r>
-              <w:rPr>
-                <w:rFonts w:ascii="Arial" w:hAnsi="Arial"/>
-                <w:b/>
-                <w:color w:val="FFFFFF"/>
-                <w:sz w:val="20"/>
-              </w:rPr>
-              <w:t>Duration</w:t>
-            </w:r>
-          </w:p>
-        </w:tc>
-        <w:tc>
-          <w:tcPr>
-            <w:tcW w:type="dxa" w:w="6840"/>
-            <w:shd w:val="clear" w:color="auto" w:fill="1F6FEB"/>
-          </w:tcPr>
-          <w:p>
-            <w:r/>
-            <w:r>
-              <w:rPr>
-                <w:rFonts w:ascii="Arial" w:hAnsi="Arial"/>
-                <w:b/>
-                <w:color w:val="FFFFFF"/>
-                <w:sz w:val="20"/>
-              </w:rPr>
-              <w:t>Topic / Activity</w:t>
-            </w:r>
-          </w:p>
-        </w:tc>
-      </w:tr>
-      <w:tr>
-        <w:trPr>
-          <w:cantSplit/>
-        </w:trPr>
-        <w:tc>
-          <w:tcPr>
-            <w:tcW w:type="dxa" w:w="1656"/>
-            <w:shd w:val="clear" w:color="auto" w:fill="F3F5F8"/>
-          </w:tcPr>
-          <w:p>
-            <w:r/>
-            <w:r>
-              <w:rPr>
-                <w:rFonts w:ascii="Arial" w:hAnsi="Arial"/>
-                <w:b w:val="0"/>
-                <w:sz w:val="19"/>
-              </w:rPr>
-              <w:t>9:00–9:20</w:t>
-            </w:r>
-          </w:p>
-        </w:tc>
-        <w:tc>
-          <w:tcPr>
-            <w:tcW w:type="dxa" w:w="1296"/>
-            <w:shd w:val="clear" w:color="auto" w:fill="F3F5F8"/>
-          </w:tcPr>
-          <w:p>
-            <w:r/>
-            <w:r>
-              <w:rPr>
-                <w:rFonts w:ascii="Arial" w:hAnsi="Arial"/>
-                <w:b w:val="0"/>
-                <w:sz w:val="19"/>
-              </w:rPr>
-              <w:t>20 min</w:t>
-            </w:r>
-          </w:p>
-        </w:tc>
-        <w:tc>
-          <w:tcPr>
-            <w:tcW w:type="dxa" w:w="6840"/>
-            <w:shd w:val="clear" w:color="auto" w:fill="F3F5F8"/>
-          </w:tcPr>
-          <w:p>
-            <w:r/>
-            <w:r>
-              <w:rPr>
-                <w:rFonts w:ascii="Arial" w:hAnsi="Arial"/>
-                <w:b w:val="0"/>
-                <w:sz w:val="19"/>
-              </w:rPr>
-              <w:t>Welcome, outcomes, resources and responsible-use ground rules</w:t>
-            </w:r>
-          </w:p>
-        </w:tc>
-      </w:tr>
-      <w:tr>
-        <w:trPr>
-          <w:cantSplit/>
-        </w:trPr>
-        <w:tc>
-          <w:tcPr>
-            <w:tcW w:type="dxa" w:w="1656"/>
-            <w:shd w:val="clear" w:color="auto" w:fill="E8F0FE"/>
-          </w:tcPr>
-          <w:p>
-            <w:r/>
-            <w:r>
-              <w:rPr>
-                <w:rFonts w:ascii="Arial" w:hAnsi="Arial"/>
-                <w:b/>
-                <w:sz w:val="19"/>
-              </w:rPr>
-              <w:t>9:20–10:05</w:t>
-            </w:r>
-          </w:p>
-        </w:tc>
-        <w:tc>
-          <w:tcPr>
-            <w:tcW w:type="dxa" w:w="1296"/>
-            <w:shd w:val="clear" w:color="auto" w:fill="E8F0FE"/>
-          </w:tcPr>
-          <w:p>
-            <w:r/>
-            <w:r>
-              <w:rPr>
-                <w:rFonts w:ascii="Arial" w:hAnsi="Arial"/>
-                <w:b w:val="0"/>
-                <w:sz w:val="19"/>
-              </w:rPr>
-              <w:t>45 min</w:t>
-            </w:r>
-          </w:p>
-        </w:tc>
-        <w:tc>
-          <w:tcPr>
-            <w:tcW w:type="dxa" w:w="6840"/>
-            <w:shd w:val="clear" w:color="auto" w:fill="E8F0FE"/>
-          </w:tcPr>
-          <w:p>
-            <w:r/>
-            <w:r>
-              <w:rPr>
-                <w:rFonts w:ascii="Arial" w:hAnsi="Arial"/>
-                <w:b/>
-                <w:sz w:val="19"/>
-              </w:rPr>
-              <w:t>Topic 1 - Voice Agent: use-case fit, listen-think-talk architecture and n8n orchestration</w:t>
-            </w:r>
-          </w:p>
-        </w:tc>
-      </w:tr>
-      <w:tr>
-        <w:trPr>
-          <w:cantSplit/>
-        </w:trPr>
-        <w:tc>
-          <w:tcPr>
-            <w:tcW w:type="dxa" w:w="1656"/>
-            <w:shd w:val="clear" w:color="auto" w:fill="E8F0FE"/>
-          </w:tcPr>
-          <w:p>
-            <w:r/>
-            <w:r>
-              <w:rPr>
-                <w:rFonts w:ascii="Arial" w:hAnsi="Arial"/>
-                <w:b/>
-                <w:sz w:val="19"/>
-              </w:rPr>
-              <w:t>10:05–10:25</w:t>
-            </w:r>
-          </w:p>
-        </w:tc>
-        <w:tc>
-          <w:tcPr>
-            <w:tcW w:type="dxa" w:w="1296"/>
-            <w:shd w:val="clear" w:color="auto" w:fill="E8F0FE"/>
-          </w:tcPr>
-          <w:p>
-            <w:r/>
-            <w:r>
-              <w:rPr>
-                <w:rFonts w:ascii="Arial" w:hAnsi="Arial"/>
-                <w:b w:val="0"/>
-                <w:sz w:val="19"/>
-              </w:rPr>
-              <w:t>20 min</w:t>
-            </w:r>
-          </w:p>
-        </w:tc>
-        <w:tc>
-          <w:tcPr>
-            <w:tcW w:type="dxa" w:w="6840"/>
-            <w:shd w:val="clear" w:color="auto" w:fill="E8F0FE"/>
-          </w:tcPr>
-          <w:p>
-            <w:r/>
-            <w:r>
-              <w:rPr>
-                <w:rFonts w:ascii="Arial" w:hAnsi="Arial"/>
-                <w:b/>
-                <w:sz w:val="19"/>
-              </w:rPr>
-              <w:t>Audio transport, Whisper transcription and ElevenLabs synthesis demonstration</w:t>
-            </w:r>
-          </w:p>
-        </w:tc>
-      </w:tr>
-      <w:tr>
-        <w:trPr>
-          <w:cantSplit/>
-        </w:trPr>
-        <w:tc>
-          <w:tcPr>
-            <w:tcW w:type="dxa" w:w="1656"/>
-            <w:shd w:val="clear" w:color="auto" w:fill="FFF4E5"/>
-          </w:tcPr>
-          <w:p>
-            <w:r/>
-            <w:r>
-              <w:rPr>
-                <w:rFonts w:ascii="Arial" w:hAnsi="Arial"/>
-                <w:b w:val="0"/>
-                <w:sz w:val="19"/>
-              </w:rPr>
-              <w:t>10:25–10:40</w:t>
-            </w:r>
-          </w:p>
-        </w:tc>
-        <w:tc>
-          <w:tcPr>
-            <w:tcW w:type="dxa" w:w="1296"/>
-            <w:shd w:val="clear" w:color="auto" w:fill="FFF4E5"/>
-          </w:tcPr>
-          <w:p>
-            <w:r/>
-            <w:r>
-              <w:rPr>
-                <w:rFonts w:ascii="Arial" w:hAnsi="Arial"/>
-                <w:b w:val="0"/>
-                <w:sz w:val="19"/>
-              </w:rPr>
-              <w:t>15 min</w:t>
-            </w:r>
-          </w:p>
-        </w:tc>
-        <w:tc>
-          <w:tcPr>
-            <w:tcW w:type="dxa" w:w="6840"/>
-            <w:shd w:val="clear" w:color="auto" w:fill="FFF4E5"/>
-          </w:tcPr>
-          <w:p>
-            <w:r/>
-            <w:r>
-              <w:rPr>
-                <w:rFonts w:ascii="Arial" w:hAnsi="Arial"/>
-                <w:b w:val="0"/>
-                <w:sz w:val="19"/>
-              </w:rPr>
-              <w:t>Tea break</w:t>
-            </w:r>
-          </w:p>
-        </w:tc>
-      </w:tr>
-      <w:tr>
-        <w:trPr>
-          <w:cantSplit/>
-        </w:trPr>
-        <w:tc>
-          <w:tcPr>
-            <w:tcW w:type="dxa" w:w="1656"/>
-          </w:tcPr>
-          <w:p>
-            <w:r/>
-            <w:r>
-              <w:rPr>
-                <w:rFonts w:ascii="Arial" w:hAnsi="Arial"/>
-                <w:b w:val="0"/>
-                <w:sz w:val="19"/>
-              </w:rPr>
-              <w:t>10:40–11:35</w:t>
-            </w:r>
-          </w:p>
-        </w:tc>
-        <w:tc>
-          <w:tcPr>
-            <w:tcW w:type="dxa" w:w="1296"/>
-          </w:tcPr>
-          <w:p>
-            <w:r/>
-            <w:r>
-              <w:rPr>
-                <w:rFonts w:ascii="Arial" w:hAnsi="Arial"/>
-                <w:b w:val="0"/>
-                <w:sz w:val="19"/>
-              </w:rPr>
-              <w:t>55 min</w:t>
-            </w:r>
-          </w:p>
-        </w:tc>
-        <w:tc>
-          <w:tcPr>
-            <w:tcW w:type="dxa" w:w="6840"/>
-          </w:tcPr>
-          <w:p>
-            <w:r/>
-            <w:r>
-              <w:rPr>
-                <w:rFonts w:ascii="Arial" w:hAnsi="Arial"/>
-                <w:b w:val="0"/>
-                <w:sz w:val="19"/>
-              </w:rPr>
-              <w:t>Hands-on: Lab 1: Build a Listen-Think-Talk Web Voice Concierge</w:t>
-            </w:r>
-          </w:p>
-        </w:tc>
-      </w:tr>
-      <w:tr>
-        <w:trPr>
-          <w:cantSplit/>
-        </w:trPr>
-        <w:tc>
-          <w:tcPr>
-            <w:tcW w:type="dxa" w:w="1656"/>
-            <w:shd w:val="clear" w:color="auto" w:fill="E8F0FE"/>
-          </w:tcPr>
-          <w:p>
-            <w:r/>
-            <w:r>
-              <w:rPr>
-                <w:rFonts w:ascii="Arial" w:hAnsi="Arial"/>
-                <w:b/>
-                <w:sz w:val="19"/>
-              </w:rPr>
-              <w:t>11:35–12:15</w:t>
-            </w:r>
-          </w:p>
-        </w:tc>
-        <w:tc>
-          <w:tcPr>
-            <w:tcW w:type="dxa" w:w="1296"/>
-            <w:shd w:val="clear" w:color="auto" w:fill="E8F0FE"/>
-          </w:tcPr>
-          <w:p>
-            <w:r/>
-            <w:r>
-              <w:rPr>
-                <w:rFonts w:ascii="Arial" w:hAnsi="Arial"/>
-                <w:b w:val="0"/>
-                <w:sz w:val="19"/>
-              </w:rPr>
-              <w:t>40 min</w:t>
-            </w:r>
-          </w:p>
-        </w:tc>
-        <w:tc>
-          <w:tcPr>
-            <w:tcW w:type="dxa" w:w="6840"/>
-            <w:shd w:val="clear" w:color="auto" w:fill="E8F0FE"/>
-          </w:tcPr>
-          <w:p>
-            <w:r/>
-            <w:r>
-              <w:rPr>
-                <w:rFonts w:ascii="Arial" w:hAnsi="Arial"/>
-                <w:b/>
-                <w:sz w:val="19"/>
-              </w:rPr>
-              <w:t>Channel adapters, latency, state, privacy and human handoff</w:t>
-            </w:r>
-          </w:p>
-        </w:tc>
-      </w:tr>
-      <w:tr>
-        <w:trPr>
-          <w:cantSplit/>
-        </w:trPr>
-        <w:tc>
-          <w:tcPr>
-            <w:tcW w:type="dxa" w:w="1656"/>
-          </w:tcPr>
-          <w:p>
-            <w:r/>
-            <w:r>
-              <w:rPr>
-                <w:rFonts w:ascii="Arial" w:hAnsi="Arial"/>
-                <w:b w:val="0"/>
-                <w:sz w:val="19"/>
-              </w:rPr>
-              <w:t>12:15–13:00</w:t>
-            </w:r>
-          </w:p>
-        </w:tc>
-        <w:tc>
-          <w:tcPr>
-            <w:tcW w:type="dxa" w:w="1296"/>
-          </w:tcPr>
-          <w:p>
-            <w:r/>
-            <w:r>
-              <w:rPr>
-                <w:rFonts w:ascii="Arial" w:hAnsi="Arial"/>
-                <w:b w:val="0"/>
-                <w:sz w:val="19"/>
-              </w:rPr>
-              <w:t>45 min</w:t>
-            </w:r>
-          </w:p>
-        </w:tc>
-        <w:tc>
-          <w:tcPr>
-            <w:tcW w:type="dxa" w:w="6840"/>
-          </w:tcPr>
-          <w:p>
-            <w:r/>
-            <w:r>
-              <w:rPr>
-                <w:rFonts w:ascii="Arial" w:hAnsi="Arial"/>
-                <w:b w:val="0"/>
-                <w:sz w:val="19"/>
-              </w:rPr>
-              <w:t>Hands-on: Lab 2: Connect the Concierge to Telegram Voice Notes</w:t>
-            </w:r>
-          </w:p>
-        </w:tc>
-      </w:tr>
-      <w:tr>
-        <w:trPr>
-          <w:cantSplit/>
-        </w:trPr>
-        <w:tc>
-          <w:tcPr>
-            <w:tcW w:type="dxa" w:w="1656"/>
-            <w:shd w:val="clear" w:color="auto" w:fill="FDE9D9"/>
-          </w:tcPr>
-          <w:p>
-            <w:r/>
-            <w:r>
-              <w:rPr>
-                <w:rFonts w:ascii="Arial" w:hAnsi="Arial"/>
-                <w:b w:val="0"/>
-                <w:sz w:val="19"/>
-              </w:rPr>
-              <w:t>13:00–14:00</w:t>
-            </w:r>
-          </w:p>
-        </w:tc>
-        <w:tc>
-          <w:tcPr>
-            <w:tcW w:type="dxa" w:w="1296"/>
-            <w:shd w:val="clear" w:color="auto" w:fill="FDE9D9"/>
-          </w:tcPr>
-          <w:p>
-            <w:r/>
-            <w:r>
-              <w:rPr>
-                <w:rFonts w:ascii="Arial" w:hAnsi="Arial"/>
-                <w:b w:val="0"/>
-                <w:sz w:val="19"/>
-              </w:rPr>
-              <w:t>60 min</w:t>
-            </w:r>
-          </w:p>
-        </w:tc>
-        <w:tc>
-          <w:tcPr>
-            <w:tcW w:type="dxa" w:w="6840"/>
-            <w:shd w:val="clear" w:color="auto" w:fill="FDE9D9"/>
-          </w:tcPr>
-          <w:p>
-            <w:r/>
-            <w:r>
-              <w:rPr>
-                <w:rFonts w:ascii="Arial" w:hAnsi="Arial"/>
-                <w:b w:val="0"/>
-                <w:sz w:val="19"/>
-              </w:rPr>
-              <w:t>Lunch break</w:t>
-            </w:r>
-          </w:p>
-        </w:tc>
-      </w:tr>
-      <w:tr>
-        <w:trPr>
-          <w:cantSplit/>
-        </w:trPr>
-        <w:tc>
-          <w:tcPr>
-            <w:tcW w:type="dxa" w:w="1656"/>
-            <w:shd w:val="clear" w:color="auto" w:fill="F3F5F8"/>
-          </w:tcPr>
-          <w:p>
-            <w:r/>
-            <w:r>
-              <w:rPr>
-                <w:rFonts w:ascii="Arial" w:hAnsi="Arial"/>
-                <w:b w:val="0"/>
-                <w:sz w:val="19"/>
-              </w:rPr>
-              <w:t>14:00–14:15</w:t>
-            </w:r>
-          </w:p>
-        </w:tc>
-        <w:tc>
-          <w:tcPr>
-            <w:tcW w:type="dxa" w:w="1296"/>
-            <w:shd w:val="clear" w:color="auto" w:fill="F3F5F8"/>
-          </w:tcPr>
-          <w:p>
-            <w:r/>
-            <w:r>
-              <w:rPr>
-                <w:rFonts w:ascii="Arial" w:hAnsi="Arial"/>
-                <w:b w:val="0"/>
-                <w:sz w:val="19"/>
-              </w:rPr>
-              <w:t>15 min</w:t>
-            </w:r>
-          </w:p>
-        </w:tc>
-        <w:tc>
-          <w:tcPr>
-            <w:tcW w:type="dxa" w:w="6840"/>
-            <w:shd w:val="clear" w:color="auto" w:fill="F3F5F8"/>
-          </w:tcPr>
-          <w:p>
-            <w:r/>
-            <w:r>
-              <w:rPr>
-                <w:rFonts w:ascii="Arial" w:hAnsi="Arial"/>
-                <w:b w:val="0"/>
-                <w:sz w:val="19"/>
-              </w:rPr>
-              <w:t>Voice-agent trace review and transition to video</w:t>
-            </w:r>
-          </w:p>
-        </w:tc>
-      </w:tr>
-      <w:tr>
-        <w:trPr>
-          <w:cantSplit/>
-        </w:trPr>
-        <w:tc>
-          <w:tcPr>
-            <w:tcW w:type="dxa" w:w="1656"/>
-            <w:shd w:val="clear" w:color="auto" w:fill="E8F0FE"/>
-          </w:tcPr>
-          <w:p>
-            <w:r/>
-            <w:r>
-              <w:rPr>
-                <w:rFonts w:ascii="Arial" w:hAnsi="Arial"/>
-                <w:b/>
-                <w:sz w:val="19"/>
-              </w:rPr>
-              <w:t>14:15–15:00</w:t>
-            </w:r>
-          </w:p>
-        </w:tc>
-        <w:tc>
-          <w:tcPr>
-            <w:tcW w:type="dxa" w:w="1296"/>
-            <w:shd w:val="clear" w:color="auto" w:fill="E8F0FE"/>
-          </w:tcPr>
-          <w:p>
-            <w:r/>
-            <w:r>
-              <w:rPr>
-                <w:rFonts w:ascii="Arial" w:hAnsi="Arial"/>
-                <w:b w:val="0"/>
-                <w:sz w:val="19"/>
-              </w:rPr>
-              <w:t>45 min</w:t>
-            </w:r>
-          </w:p>
-        </w:tc>
-        <w:tc>
-          <w:tcPr>
-            <w:tcW w:type="dxa" w:w="6840"/>
-            <w:shd w:val="clear" w:color="auto" w:fill="E8F0FE"/>
-          </w:tcPr>
-          <w:p>
-            <w:r/>
-            <w:r>
-              <w:rPr>
-                <w:rFonts w:ascii="Arial" w:hAnsi="Arial"/>
-                <w:b/>
-                <w:sz w:val="19"/>
-              </w:rPr>
-              <w:t>Topic 2 - Video Agent: avatar anatomy, script contracts and asynchronous APIs</w:t>
-            </w:r>
-          </w:p>
-        </w:tc>
-      </w:tr>
-      <w:tr>
-        <w:trPr>
-          <w:cantSplit/>
-        </w:trPr>
-        <w:tc>
-          <w:tcPr>
-            <w:tcW w:type="dxa" w:w="1656"/>
-            <w:shd w:val="clear" w:color="auto" w:fill="E8F0FE"/>
-          </w:tcPr>
-          <w:p>
-            <w:r/>
-            <w:r>
-              <w:rPr>
-                <w:rFonts w:ascii="Arial" w:hAnsi="Arial"/>
-                <w:b/>
-                <w:sz w:val="19"/>
-              </w:rPr>
-              <w:t>15:00–15:30</w:t>
-            </w:r>
-          </w:p>
-        </w:tc>
-        <w:tc>
-          <w:tcPr>
-            <w:tcW w:type="dxa" w:w="1296"/>
-            <w:shd w:val="clear" w:color="auto" w:fill="E8F0FE"/>
-          </w:tcPr>
-          <w:p>
-            <w:r/>
-            <w:r>
-              <w:rPr>
-                <w:rFonts w:ascii="Arial" w:hAnsi="Arial"/>
-                <w:b w:val="0"/>
-                <w:sz w:val="19"/>
-              </w:rPr>
-              <w:t>30 min</w:t>
-            </w:r>
-          </w:p>
-        </w:tc>
-        <w:tc>
-          <w:tcPr>
-            <w:tcW w:type="dxa" w:w="6840"/>
-            <w:shd w:val="clear" w:color="auto" w:fill="E8F0FE"/>
-          </w:tcPr>
-          <w:p>
-            <w:r/>
-            <w:r>
-              <w:rPr>
-                <w:rFonts w:ascii="Arial" w:hAnsi="Arial"/>
-                <w:b/>
-                <w:sz w:val="19"/>
-              </w:rPr>
-              <w:t>Polling, consent, accessibility, quality and cost controls</w:t>
-            </w:r>
-          </w:p>
-        </w:tc>
-      </w:tr>
-      <w:tr>
-        <w:trPr>
-          <w:cantSplit/>
-        </w:trPr>
-        <w:tc>
-          <w:tcPr>
-            <w:tcW w:type="dxa" w:w="1656"/>
-            <w:shd w:val="clear" w:color="auto" w:fill="FFF4E5"/>
-          </w:tcPr>
-          <w:p>
-            <w:r/>
-            <w:r>
-              <w:rPr>
-                <w:rFonts w:ascii="Arial" w:hAnsi="Arial"/>
-                <w:b w:val="0"/>
-                <w:sz w:val="19"/>
-              </w:rPr>
-              <w:t>15:30–15:45</w:t>
-            </w:r>
-          </w:p>
-        </w:tc>
-        <w:tc>
-          <w:tcPr>
-            <w:tcW w:type="dxa" w:w="1296"/>
-            <w:shd w:val="clear" w:color="auto" w:fill="FFF4E5"/>
-          </w:tcPr>
-          <w:p>
-            <w:r/>
-            <w:r>
-              <w:rPr>
-                <w:rFonts w:ascii="Arial" w:hAnsi="Arial"/>
-                <w:b w:val="0"/>
-                <w:sz w:val="19"/>
-              </w:rPr>
-              <w:t>15 min</w:t>
-            </w:r>
-          </w:p>
-        </w:tc>
-        <w:tc>
-          <w:tcPr>
-            <w:tcW w:type="dxa" w:w="6840"/>
-            <w:shd w:val="clear" w:color="auto" w:fill="FFF4E5"/>
-          </w:tcPr>
-          <w:p>
-            <w:r/>
-            <w:r>
-              <w:rPr>
-                <w:rFonts w:ascii="Arial" w:hAnsi="Arial"/>
-                <w:b w:val="0"/>
-                <w:sz w:val="19"/>
-              </w:rPr>
-              <w:t>Tea break</w:t>
-            </w:r>
-          </w:p>
-        </w:tc>
-      </w:tr>
-      <w:tr>
-        <w:trPr>
-          <w:cantSplit/>
-        </w:trPr>
-        <w:tc>
-          <w:tcPr>
-            <w:tcW w:type="dxa" w:w="1656"/>
-          </w:tcPr>
-          <w:p>
-            <w:r/>
-            <w:r>
-              <w:rPr>
-                <w:rFonts w:ascii="Arial" w:hAnsi="Arial"/>
-                <w:b w:val="0"/>
-                <w:sz w:val="19"/>
-              </w:rPr>
-              <w:t>15:45–16:40</w:t>
-            </w:r>
-          </w:p>
-        </w:tc>
-        <w:tc>
-          <w:tcPr>
-            <w:tcW w:type="dxa" w:w="1296"/>
-          </w:tcPr>
-          <w:p>
-            <w:r/>
-            <w:r>
-              <w:rPr>
-                <w:rFonts w:ascii="Arial" w:hAnsi="Arial"/>
-                <w:b w:val="0"/>
-                <w:sz w:val="19"/>
-              </w:rPr>
-              <w:t>55 min</w:t>
-            </w:r>
-          </w:p>
-        </w:tc>
-        <w:tc>
-          <w:tcPr>
-            <w:tcW w:type="dxa" w:w="6840"/>
-          </w:tcPr>
-          <w:p>
-            <w:r/>
-            <w:r>
-              <w:rPr>
-                <w:rFonts w:ascii="Arial" w:hAnsi="Arial"/>
-                <w:b w:val="0"/>
-                <w:sz w:val="19"/>
-              </w:rPr>
-              <w:t>Hands-on: Lab 3: Generate a Talking-Head Welcome Video</w:t>
-            </w:r>
-          </w:p>
-        </w:tc>
-      </w:tr>
-      <w:tr>
-        <w:trPr>
-          <w:cantSplit/>
-        </w:trPr>
-        <w:tc>
-          <w:tcPr>
-            <w:tcW w:type="dxa" w:w="1656"/>
-            <w:shd w:val="clear" w:color="auto" w:fill="E8F0FE"/>
-          </w:tcPr>
-          <w:p>
-            <w:r/>
-            <w:r>
-              <w:rPr>
-                <w:rFonts w:ascii="Arial" w:hAnsi="Arial"/>
-                <w:b/>
-                <w:sz w:val="19"/>
-              </w:rPr>
-              <w:t>16:40–17:00</w:t>
-            </w:r>
-          </w:p>
-        </w:tc>
-        <w:tc>
-          <w:tcPr>
-            <w:tcW w:type="dxa" w:w="1296"/>
-            <w:shd w:val="clear" w:color="auto" w:fill="E8F0FE"/>
-          </w:tcPr>
-          <w:p>
-            <w:r/>
-            <w:r>
-              <w:rPr>
-                <w:rFonts w:ascii="Arial" w:hAnsi="Arial"/>
-                <w:b w:val="0"/>
-                <w:sz w:val="19"/>
-              </w:rPr>
-              <w:t>20 min</w:t>
-            </w:r>
-          </w:p>
-        </w:tc>
-        <w:tc>
-          <w:tcPr>
-            <w:tcW w:type="dxa" w:w="6840"/>
-            <w:shd w:val="clear" w:color="auto" w:fill="E8F0FE"/>
-          </w:tcPr>
-          <w:p>
-            <w:r/>
-            <w:r>
-              <w:rPr>
-                <w:rFonts w:ascii="Arial" w:hAnsi="Arial"/>
-                <w:b/>
-                <w:sz w:val="19"/>
-              </w:rPr>
-              <w:t>End-to-end production, approval and distribution patterns</w:t>
-            </w:r>
-          </w:p>
-        </w:tc>
-      </w:tr>
-      <w:tr>
-        <w:trPr>
-          <w:cantSplit/>
-        </w:trPr>
-        <w:tc>
-          <w:tcPr>
-            <w:tcW w:type="dxa" w:w="1656"/>
-          </w:tcPr>
-          <w:p>
-            <w:r/>
-            <w:r>
-              <w:rPr>
-                <w:rFonts w:ascii="Arial" w:hAnsi="Arial"/>
-                <w:b w:val="0"/>
-                <w:sz w:val="19"/>
-              </w:rPr>
-              <w:t>17:00–17:50</w:t>
-            </w:r>
-          </w:p>
-        </w:tc>
-        <w:tc>
-          <w:tcPr>
-            <w:tcW w:type="dxa" w:w="1296"/>
-          </w:tcPr>
-          <w:p>
-            <w:r/>
-            <w:r>
-              <w:rPr>
-                <w:rFonts w:ascii="Arial" w:hAnsi="Arial"/>
-                <w:b w:val="0"/>
-                <w:sz w:val="19"/>
-              </w:rPr>
-              <w:t>50 min</w:t>
-            </w:r>
-          </w:p>
-        </w:tc>
-        <w:tc>
-          <w:tcPr>
-            <w:tcW w:type="dxa" w:w="6840"/>
-          </w:tcPr>
-          <w:p>
-            <w:r/>
-            <w:r>
-              <w:rPr>
-                <w:rFonts w:ascii="Arial" w:hAnsi="Arial"/>
-                <w:b w:val="0"/>
-                <w:sz w:val="19"/>
-              </w:rPr>
-              <w:t>Hands-on: Lab 4: Automate a Governed Video Campaign Pipeline</w:t>
-            </w:r>
-          </w:p>
-        </w:tc>
-      </w:tr>
-      <w:tr>
-        <w:trPr>
-          <w:cantSplit/>
-        </w:trPr>
-        <w:tc>
-          <w:tcPr>
-            <w:tcW w:type="dxa" w:w="1656"/>
-            <w:shd w:val="clear" w:color="auto" w:fill="F3F5F8"/>
-          </w:tcPr>
-          <w:p>
-            <w:r/>
-            <w:r>
-              <w:rPr>
-                <w:rFonts w:ascii="Arial" w:hAnsi="Arial"/>
-                <w:b w:val="0"/>
-                <w:sz w:val="19"/>
-              </w:rPr>
-              <w:t>17:50–18:00</w:t>
-            </w:r>
-          </w:p>
-        </w:tc>
-        <w:tc>
-          <w:tcPr>
-            <w:tcW w:type="dxa" w:w="1296"/>
-            <w:shd w:val="clear" w:color="auto" w:fill="F3F5F8"/>
-          </w:tcPr>
-          <w:p>
-            <w:r/>
-            <w:r>
-              <w:rPr>
-                <w:rFonts w:ascii="Arial" w:hAnsi="Arial"/>
-                <w:b w:val="0"/>
-                <w:sz w:val="19"/>
-              </w:rPr>
-              <w:t>10 min</w:t>
-            </w:r>
-          </w:p>
-        </w:tc>
-        <w:tc>
-          <w:tcPr>
-            <w:tcW w:type="dxa" w:w="6840"/>
-            <w:shd w:val="clear" w:color="auto" w:fill="F3F5F8"/>
-          </w:tcPr>
-          <w:p>
-            <w:r/>
-            <w:r>
-              <w:rPr>
-                <w:rFonts w:ascii="Arial" w:hAnsi="Arial"/>
-                <w:b w:val="0"/>
-                <w:sz w:val="19"/>
-              </w:rPr>
-              <w:t>Course recap, implementation checklist and next steps</w:t>
-            </w:r>
-          </w:p>
-        </w:tc>
-      </w:tr>
-    </w:tbl>
-    <w:p>
-      <w:r>
-        <w:rPr>
-          <w:i/>
-          <w:color w:val="555B66"/>
-          <w:sz w:val="19"/>
-        </w:rPr>
-        <w:t>Total scheduled time: 480 minutes (8 hours) excluding lunch — of which 450 minutes (7.5 hours) are instructional, plus 30 minutes of tea breaks.</w:t>
-      </w:r>
-    </w:p>
-    <w:p>
-      <w:pPr>
-        <w:pStyle w:val="Heading1"/>
-      </w:pPr>
-      <w:r>
-        <w:t>Lab Reference (aligned to course topics)</w:t>
-      </w:r>
-    </w:p>
-    <w:tbl>
-      <w:tblPr>
-        <w:tblStyle w:val="TableGrid"/>
-        <w:tblW w:type="auto" w:w="0"/>
-        <w:tblLook w:firstColumn="1" w:firstRow="1" w:lastColumn="0" w:lastRow="0" w:noHBand="0" w:noVBand="1" w:val="04A0"/>
-      </w:tblPr>
-      <w:tblGrid>
-        <w:gridCol w:w="2880"/>
-        <w:gridCol w:w="2880"/>
-        <w:gridCol w:w="2880"/>
-      </w:tblGrid>
-      <w:tr>
-        <w:trPr>
-          <w:tblHeader w:val="true"/>
-        </w:trPr>
-        <w:tc>
-          <w:tcPr>
-            <w:tcW w:type="dxa" w:w="2880"/>
-            <w:shd w:val="clear" w:color="auto" w:fill="1F6FEB"/>
-          </w:tcPr>
-          <w:p>
-            <w:r/>
-            <w:r>
-              <w:rPr>
-                <w:rFonts w:ascii="Arial" w:hAnsi="Arial"/>
-                <w:b/>
-                <w:color w:val="FFFFFF"/>
-                <w:sz w:val="20"/>
-              </w:rPr>
               <w:t>Topic</w:t>
             </w:r>
           </w:p>
         </w:tc>
         <w:tc>
           <w:tcPr>
-            <w:tcW w:type="dxa" w:w="2880"/>
-            <w:shd w:val="clear" w:color="auto" w:fill="1F6FEB"/>
+            <w:tcW w:type="dxa" w:w="1728"/>
           </w:tcPr>
           <w:p>
-            <w:r/>
             <w:r>
-              <w:rPr>
-                <w:rFonts w:ascii="Arial" w:hAnsi="Arial"/>
-                <w:b/>
-                <w:color w:val="FFFFFF"/>
-                <w:sz w:val="20"/>
-              </w:rPr>
-              <w:t>Coverage</w:t>
+              <w:t>Focus</w:t>
             </w:r>
           </w:p>
         </w:tc>
         <w:tc>
           <w:tcPr>
-            <w:tcW w:type="dxa" w:w="2880"/>
-            <w:shd w:val="clear" w:color="auto" w:fill="1F6FEB"/>
+            <w:tcW w:type="dxa" w:w="1728"/>
           </w:tcPr>
           <w:p>
-            <w:r/>
             <w:r>
-              <w:rPr>
-                <w:rFonts w:ascii="Arial" w:hAnsi="Arial"/>
-                <w:b/>
-                <w:color w:val="FFFFFF"/>
-                <w:sz w:val="20"/>
-              </w:rPr>
+              <w:t>Learning outcome</w:t>
+            </w:r>
+          </w:p>
+        </w:tc>
+        <w:tc>
+          <w:tcPr>
+            <w:tcW w:type="dxa" w:w="1728"/>
+          </w:tcPr>
+          <w:p>
+            <w:r>
               <w:t>Labs</w:t>
             </w:r>
           </w:p>
@@ -1895,51 +814,51 @@
       <w:tr>
         <w:tc>
           <w:tcPr>
-            <w:tcW w:type="dxa" w:w="2880"/>
-            <w:shd w:val="clear" w:color="auto" w:fill="E8F0FE"/>
+            <w:tcW w:type="dxa" w:w="1728"/>
           </w:tcPr>
           <w:p>
-            <w:r/>
             <w:r>
-              <w:rPr>
-                <w:rFonts w:ascii="Arial" w:hAnsi="Arial"/>
-                <w:b/>
-                <w:sz w:val="19"/>
-              </w:rPr>
-              <w:t>Topic 01: Voice Agent</w:t>
+              <w:t>1</w:t>
             </w:r>
           </w:p>
         </w:tc>
         <w:tc>
           <w:tcPr>
-            <w:tcW w:type="dxa" w:w="2880"/>
-            <w:shd w:val="clear" w:color="auto" w:fill="E8F0FE"/>
+            <w:tcW w:type="dxa" w:w="1728"/>
           </w:tcPr>
           <w:p>
-            <w:r/>
             <w:r>
-              <w:rPr>
-                <w:rFonts w:ascii="Arial" w:hAnsi="Arial"/>
-                <w:b w:val="0"/>
-                <w:sz w:val="19"/>
-              </w:rPr>
-              <w:t>2 of 4 labs (50%)</w:t>
+              <w:t>Topic 01 - Chatbot</w:t>
             </w:r>
           </w:p>
         </w:tc>
         <w:tc>
           <w:tcPr>
-            <w:tcW w:type="dxa" w:w="2880"/>
+            <w:tcW w:type="dxa" w:w="1728"/>
           </w:tcPr>
           <w:p>
-            <w:r/>
             <w:r>
-              <w:rPr>
-                <w:rFonts w:ascii="Arial" w:hAnsi="Arial"/>
-                <w:b w:val="0"/>
-                <w:sz w:val="19"/>
-              </w:rPr>
-              <w:t>Lab 1, Lab 2</w:t>
+              <w:t>Agents, retrieval and grounded answers: your first n8n AI agent, a RAG chatbot that admits what it does not know, and a customer-facing course advisor on a real website. Labs 0-3.</w:t>
+            </w:r>
+          </w:p>
+        </w:tc>
+        <w:tc>
+          <w:tcPr>
+            <w:tcW w:type="dxa" w:w="1728"/>
+          </w:tcPr>
+          <w:p>
+            <w:r>
+              <w:t>LO1</w:t>
+            </w:r>
+          </w:p>
+        </w:tc>
+        <w:tc>
+          <w:tcPr>
+            <w:tcW w:type="dxa" w:w="1728"/>
+          </w:tcPr>
+          <w:p>
+            <w:r>
+              <w:t>Lab 0, Lab 1, Lab 2, Lab 3</w:t>
             </w:r>
           </w:p>
         </w:tc>
@@ -1947,58 +866,1176 @@
       <w:tr>
         <w:tc>
           <w:tcPr>
-            <w:tcW w:type="dxa" w:w="2880"/>
-            <w:shd w:val="clear" w:color="auto" w:fill="E8F0FE"/>
+            <w:tcW w:type="dxa" w:w="1728"/>
           </w:tcPr>
           <w:p>
-            <w:r/>
             <w:r>
-              <w:rPr>
-                <w:rFonts w:ascii="Arial" w:hAnsi="Arial"/>
-                <w:b/>
-                <w:sz w:val="19"/>
-              </w:rPr>
-              <w:t>Topic 02: Video Agent</w:t>
+              <w:t>2</w:t>
             </w:r>
           </w:p>
         </w:tc>
         <w:tc>
           <w:tcPr>
-            <w:tcW w:type="dxa" w:w="2880"/>
-            <w:shd w:val="clear" w:color="auto" w:fill="E8F0FE"/>
+            <w:tcW w:type="dxa" w:w="1728"/>
           </w:tcPr>
           <w:p>
-            <w:r/>
             <w:r>
-              <w:rPr>
-                <w:rFonts w:ascii="Arial" w:hAnsi="Arial"/>
-                <w:b w:val="0"/>
-                <w:sz w:val="19"/>
-              </w:rPr>
-              <w:t>2 of 4 labs (50%)</w:t>
+              <w:t>Topic 02 - Voice Agent</w:t>
             </w:r>
           </w:p>
         </w:tc>
         <w:tc>
           <w:tcPr>
-            <w:tcW w:type="dxa" w:w="2880"/>
+            <w:tcW w:type="dxa" w:w="1728"/>
           </w:tcPr>
           <w:p>
-            <w:r/>
             <w:r>
-              <w:rPr>
-                <w:rFonts w:ascii="Arial" w:hAnsi="Arial"/>
-                <w:b w:val="0"/>
-                <w:sz w:val="19"/>
-              </w:rPr>
-              <w:t>Lab 3, Lab 4</w:t>
+              <w:t>Two vendors, two architectures: ElevenLabs runs the model and calls your n8n tools; with Vapi your n8n workflow IS the model. The contrast is the lesson. Labs 4-5.</w:t>
+            </w:r>
+          </w:p>
+        </w:tc>
+        <w:tc>
+          <w:tcPr>
+            <w:tcW w:type="dxa" w:w="1728"/>
+          </w:tcPr>
+          <w:p>
+            <w:r>
+              <w:t>LO2</w:t>
+            </w:r>
+          </w:p>
+        </w:tc>
+        <w:tc>
+          <w:tcPr>
+            <w:tcW w:type="dxa" w:w="1728"/>
+          </w:tcPr>
+          <w:p>
+            <w:r>
+              <w:t>Lab 4, Lab 5</w:t>
+            </w:r>
+          </w:p>
+        </w:tc>
+      </w:tr>
+      <w:tr>
+        <w:tc>
+          <w:tcPr>
+            <w:tcW w:type="dxa" w:w="1728"/>
+          </w:tcPr>
+          <w:p>
+            <w:r>
+              <w:t>3</w:t>
+            </w:r>
+          </w:p>
+        </w:tc>
+        <w:tc>
+          <w:tcPr>
+            <w:tcW w:type="dxa" w:w="1728"/>
+          </w:tcPr>
+          <w:p>
+            <w:r>
+              <w:t>Topic 03 - Video Agent</w:t>
+            </w:r>
+          </w:p>
+        </w:tc>
+        <w:tc>
+          <w:tcPr>
+            <w:tcW w:type="dxa" w:w="1728"/>
+          </w:tcPr>
+          <w:p>
+            <w:r>
+              <w:t>Lip-sync, avatars and text-to-video: from a script, to a mouth that moves, to a face that talks back, to video from nothing but a sentence. Labs 6-10.</w:t>
+            </w:r>
+          </w:p>
+        </w:tc>
+        <w:tc>
+          <w:tcPr>
+            <w:tcW w:type="dxa" w:w="1728"/>
+          </w:tcPr>
+          <w:p>
+            <w:r>
+              <w:t>LO3</w:t>
+            </w:r>
+          </w:p>
+        </w:tc>
+        <w:tc>
+          <w:tcPr>
+            <w:tcW w:type="dxa" w:w="1728"/>
+          </w:tcPr>
+          <w:p>
+            <w:r>
+              <w:t>Lab 6, Lab 7, Lab 7-os, Lab 8, Lab 9, Lab 10</w:t>
             </w:r>
           </w:p>
         </w:tc>
       </w:tr>
     </w:tbl>
+    <w:p/>
+    <w:p>
+      <w:pPr>
+        <w:pStyle w:val="Heading1"/>
+      </w:pPr>
+      <w:r>
+        <w:t>Daily schedule</w:t>
+      </w:r>
+    </w:p>
+    <w:p/>
+    <w:p>
+      <w:r>
+        <w:t>Total taught content: 13 hours 00 minutes across 12 labs.</w:t>
+      </w:r>
+    </w:p>
+    <w:p/>
+    <w:p>
+      <w:pPr>
+        <w:pStyle w:val="Heading2"/>
+      </w:pPr>
+      <w:r>
+        <w:t>Day 1</w:t>
+      </w:r>
+    </w:p>
+    <w:p/>
+    <w:tbl>
+      <w:tblPr>
+        <w:tblStyle w:val="LightGrid-Accent1"/>
+        <w:tblW w:type="auto" w:w="0"/>
+        <w:tblLook w:firstColumn="1" w:firstRow="1" w:lastColumn="0" w:lastRow="0" w:noHBand="0" w:noVBand="1" w:val="04A0"/>
+      </w:tblPr>
+      <w:tblGrid>
+        <w:gridCol w:w="1728"/>
+        <w:gridCol w:w="1728"/>
+        <w:gridCol w:w="1728"/>
+        <w:gridCol w:w="1728"/>
+        <w:gridCol w:w="1728"/>
+      </w:tblGrid>
+      <w:tr>
+        <w:tc>
+          <w:tcPr>
+            <w:tcW w:type="dxa" w:w="1728"/>
+          </w:tcPr>
+          <w:p>
+            <w:r>
+              <w:t>Time</w:t>
+            </w:r>
+          </w:p>
+        </w:tc>
+        <w:tc>
+          <w:tcPr>
+            <w:tcW w:type="dxa" w:w="1728"/>
+          </w:tcPr>
+          <w:p>
+            <w:r>
+              <w:t>Duration</w:t>
+            </w:r>
+          </w:p>
+        </w:tc>
+        <w:tc>
+          <w:tcPr>
+            <w:tcW w:type="dxa" w:w="1728"/>
+          </w:tcPr>
+          <w:p>
+            <w:r>
+              <w:t>Topic / Activity</w:t>
+            </w:r>
+          </w:p>
+        </w:tc>
+        <w:tc>
+          <w:tcPr>
+            <w:tcW w:type="dxa" w:w="1728"/>
+          </w:tcPr>
+          <w:p>
+            <w:r>
+              <w:t>Deck</w:t>
+            </w:r>
+          </w:p>
+        </w:tc>
+        <w:tc>
+          <w:tcPr>
+            <w:tcW w:type="dxa" w:w="1728"/>
+          </w:tcPr>
+          <w:p>
+            <w:r>
+              <w:t>Evidence produced</w:t>
+            </w:r>
+          </w:p>
+        </w:tc>
+      </w:tr>
+      <w:tr>
+        <w:tc>
+          <w:tcPr>
+            <w:tcW w:type="dxa" w:w="1728"/>
+          </w:tcPr>
+          <w:p>
+            <w:r>
+              <w:t>9:30am - 10:10am</w:t>
+            </w:r>
+          </w:p>
+        </w:tc>
+        <w:tc>
+          <w:tcPr>
+            <w:tcW w:type="dxa" w:w="1728"/>
+          </w:tcPr>
+          <w:p>
+            <w:r>
+              <w:t>40 min</w:t>
+            </w:r>
+          </w:p>
+        </w:tc>
+        <w:tc>
+          <w:tcPr>
+            <w:tcW w:type="dxa" w:w="1728"/>
+          </w:tcPr>
+          <w:p>
+            <w:r>
+              <w:t>Lab 0 - Set Up n8n Locally</w:t>
+            </w:r>
+          </w:p>
+        </w:tc>
+        <w:tc>
+          <w:tcPr>
+            <w:tcW w:type="dxa" w:w="1728"/>
+          </w:tcPr>
+          <w:p>
+            <w:r>
+              <w:t>Slide 18</w:t>
+            </w:r>
+          </w:p>
+        </w:tc>
+        <w:tc>
+          <w:tcPr>
+            <w:tcW w:type="dxa" w:w="1728"/>
+          </w:tcPr>
+          <w:p>
+            <w:r>
+              <w:t>A running local stack: screenshots of docker compose ps, ollama list and the passing credential test.</w:t>
+            </w:r>
+          </w:p>
+        </w:tc>
+      </w:tr>
+      <w:tr>
+        <w:tc>
+          <w:tcPr>
+            <w:tcW w:type="dxa" w:w="1728"/>
+          </w:tcPr>
+          <w:p>
+            <w:r>
+              <w:t>10:10am - 10:50am</w:t>
+            </w:r>
+          </w:p>
+        </w:tc>
+        <w:tc>
+          <w:tcPr>
+            <w:tcW w:type="dxa" w:w="1728"/>
+          </w:tcPr>
+          <w:p>
+            <w:r>
+              <w:t>40 min</w:t>
+            </w:r>
+          </w:p>
+        </w:tc>
+        <w:tc>
+          <w:tcPr>
+            <w:tcW w:type="dxa" w:w="1728"/>
+          </w:tcPr>
+          <w:p>
+            <w:r>
+              <w:t>Lab 1 - Your First AI Agent</w:t>
+            </w:r>
+          </w:p>
+        </w:tc>
+        <w:tc>
+          <w:tcPr>
+            <w:tcW w:type="dxa" w:w="1728"/>
+          </w:tcPr>
+          <w:p>
+            <w:r>
+              <w:t>Slide 24</w:t>
+            </w:r>
+          </w:p>
+        </w:tc>
+        <w:tc>
+          <w:tcPr>
+            <w:tcW w:type="dxa" w:w="1728"/>
+          </w:tcPr>
+          <w:p>
+            <w:r>
+              <w:t>A working local agent plus a one-line note on how the system prompt changed its behaviour.</w:t>
+            </w:r>
+          </w:p>
+        </w:tc>
+      </w:tr>
+      <w:tr>
+        <w:tc>
+          <w:tcPr>
+            <w:tcW w:type="dxa" w:w="1728"/>
+          </w:tcPr>
+          <w:p>
+            <w:r>
+              <w:t>10:50am - 11:45am</w:t>
+            </w:r>
+          </w:p>
+        </w:tc>
+        <w:tc>
+          <w:tcPr>
+            <w:tcW w:type="dxa" w:w="1728"/>
+          </w:tcPr>
+          <w:p>
+            <w:r>
+              <w:t>55 min</w:t>
+            </w:r>
+          </w:p>
+        </w:tc>
+        <w:tc>
+          <w:tcPr>
+            <w:tcW w:type="dxa" w:w="1728"/>
+          </w:tcPr>
+          <w:p>
+            <w:r>
+              <w:t>Lab 2 - RAG IT Support Chatbot</w:t>
+            </w:r>
+          </w:p>
+        </w:tc>
+        <w:tc>
+          <w:tcPr>
+            <w:tcW w:type="dxa" w:w="1728"/>
+          </w:tcPr>
+          <w:p>
+            <w:r>
+              <w:t>Slide 30</w:t>
+            </w:r>
+          </w:p>
+        </w:tc>
+        <w:tc>
+          <w:tcPr>
+            <w:tcW w:type="dxa" w:w="1728"/>
+          </w:tcPr>
+          <w:p>
+            <w:r>
+              <w:t>A RAG chatbot answering from the IT FAQ, plus one provoked refusal captured in the execution trace.</w:t>
+            </w:r>
+          </w:p>
+        </w:tc>
+      </w:tr>
+      <w:tr>
+        <w:tc>
+          <w:tcPr>
+            <w:tcW w:type="dxa" w:w="1728"/>
+          </w:tcPr>
+          <w:p>
+            <w:r>
+              <w:t>11:45am - 12:40pm</w:t>
+            </w:r>
+          </w:p>
+        </w:tc>
+        <w:tc>
+          <w:tcPr>
+            <w:tcW w:type="dxa" w:w="1728"/>
+          </w:tcPr>
+          <w:p>
+            <w:r>
+              <w:t>55 min</w:t>
+            </w:r>
+          </w:p>
+        </w:tc>
+        <w:tc>
+          <w:tcPr>
+            <w:tcW w:type="dxa" w:w="1728"/>
+          </w:tcPr>
+          <w:p>
+            <w:r>
+              <w:t>Lab 3 - CX Agent with RAG (Cook &amp; Bake Academy)</w:t>
+            </w:r>
+          </w:p>
+        </w:tc>
+        <w:tc>
+          <w:tcPr>
+            <w:tcW w:type="dxa" w:w="1728"/>
+          </w:tcPr>
+          <w:p>
+            <w:r>
+              <w:t>Slide 37</w:t>
+            </w:r>
+          </w:p>
+        </w:tc>
+        <w:tc>
+          <w:tcPr>
+            <w:tcW w:type="dxa" w:w="1728"/>
+          </w:tcPr>
+          <w:p>
+            <w:r>
+              <w:t>A working course-advisory chatbot on the site, with one grounded answer and one honest refusal in the trace.</w:t>
+            </w:r>
+          </w:p>
+        </w:tc>
+      </w:tr>
+      <w:tr>
+        <w:tc>
+          <w:tcPr>
+            <w:tcW w:type="dxa" w:w="1728"/>
+          </w:tcPr>
+          <w:p>
+            <w:r>
+              <w:t>12:40pm - 1:10pm</w:t>
+            </w:r>
+          </w:p>
+        </w:tc>
+        <w:tc>
+          <w:tcPr>
+            <w:tcW w:type="dxa" w:w="1728"/>
+          </w:tcPr>
+          <w:p>
+            <w:r>
+              <w:t>30 min</w:t>
+            </w:r>
+          </w:p>
+        </w:tc>
+        <w:tc>
+          <w:tcPr>
+            <w:tcW w:type="dxa" w:w="1728"/>
+          </w:tcPr>
+          <w:p>
+            <w:r>
+              <w:t>LUNCH</w:t>
+            </w:r>
+          </w:p>
+        </w:tc>
+        <w:tc>
+          <w:tcPr>
+            <w:tcW w:type="dxa" w:w="1728"/>
+          </w:tcPr>
+          <w:p>
+            <w:r>
+              <w:t>-</w:t>
+            </w:r>
+          </w:p>
+        </w:tc>
+        <w:tc>
+          <w:tcPr>
+            <w:tcW w:type="dxa" w:w="1728"/>
+          </w:tcPr>
+          <w:p>
+            <w:r>
+              <w:t>-</w:t>
+            </w:r>
+          </w:p>
+        </w:tc>
+      </w:tr>
+      <w:tr>
+        <w:tc>
+          <w:tcPr>
+            <w:tcW w:type="dxa" w:w="1728"/>
+          </w:tcPr>
+          <w:p>
+            <w:r>
+              <w:t>1:10pm - 3:10pm</w:t>
+            </w:r>
+          </w:p>
+        </w:tc>
+        <w:tc>
+          <w:tcPr>
+            <w:tcW w:type="dxa" w:w="1728"/>
+          </w:tcPr>
+          <w:p>
+            <w:r>
+              <w:t>120 min</w:t>
+            </w:r>
+          </w:p>
+        </w:tc>
+        <w:tc>
+          <w:tcPr>
+            <w:tcW w:type="dxa" w:w="1728"/>
+          </w:tcPr>
+          <w:p>
+            <w:r>
+              <w:t>Lab 4 - Voice Booking Agent with ElevenLabs (GG Hair Salon)</w:t>
+            </w:r>
+          </w:p>
+        </w:tc>
+        <w:tc>
+          <w:tcPr>
+            <w:tcW w:type="dxa" w:w="1728"/>
+          </w:tcPr>
+          <w:p>
+            <w:r>
+              <w:t>Slide 50</w:t>
+            </w:r>
+          </w:p>
+        </w:tc>
+        <w:tc>
+          <w:tcPr>
+            <w:tcW w:type="dxa" w:w="1728"/>
+          </w:tcPr>
+          <w:p>
+            <w:r>
+              <w:t>A real calendar booking made by voice: the calendar event, the call transcript, and the n8n tool execution.</w:t>
+            </w:r>
+          </w:p>
+        </w:tc>
+      </w:tr>
+      <w:tr>
+        <w:tc>
+          <w:tcPr>
+            <w:tcW w:type="dxa" w:w="1728"/>
+          </w:tcPr>
+          <w:p>
+            <w:r>
+              <w:t>3:10pm - 4:35pm</w:t>
+            </w:r>
+          </w:p>
+        </w:tc>
+        <w:tc>
+          <w:tcPr>
+            <w:tcW w:type="dxa" w:w="1728"/>
+          </w:tcPr>
+          <w:p>
+            <w:r>
+              <w:t>85 min</w:t>
+            </w:r>
+          </w:p>
+        </w:tc>
+        <w:tc>
+          <w:tcPr>
+            <w:tcW w:type="dxa" w:w="1728"/>
+          </w:tcPr>
+          <w:p>
+            <w:r>
+              <w:t>Lab 5 - Grounded FAQ Voice Agent with Vapi (MediRefill)</w:t>
+            </w:r>
+          </w:p>
+        </w:tc>
+        <w:tc>
+          <w:tcPr>
+            <w:tcW w:type="dxa" w:w="1728"/>
+          </w:tcPr>
+          <w:p>
+            <w:r>
+              <w:t>Slide 57</w:t>
+            </w:r>
+          </w:p>
+        </w:tc>
+        <w:tc>
+          <w:tcPr>
+            <w:tcW w:type="dxa" w:w="1728"/>
+          </w:tcPr>
+          <w:p>
+            <w:r>
+              <w:t>A live Vapi call transcript showing grounded answers, a hard medical refusal, and the emergency escalation.</w:t>
+            </w:r>
+          </w:p>
+        </w:tc>
+      </w:tr>
+      <w:tr>
+        <w:tc>
+          <w:tcPr>
+            <w:tcW w:type="dxa" w:w="1728"/>
+          </w:tcPr>
+          <w:p>
+            <w:r>
+              <w:t>4:35pm - 5:30pm</w:t>
+            </w:r>
+          </w:p>
+        </w:tc>
+        <w:tc>
+          <w:tcPr>
+            <w:tcW w:type="dxa" w:w="1728"/>
+          </w:tcPr>
+          <w:p>
+            <w:r>
+              <w:t>55 min</w:t>
+            </w:r>
+          </w:p>
+        </w:tc>
+        <w:tc>
+          <w:tcPr>
+            <w:tcW w:type="dxa" w:w="1728"/>
+          </w:tcPr>
+          <w:p>
+            <w:r>
+              <w:t>Concept delivery, review and evidence check - the trainer teaches the concept, workflow and quality slides for the day's labs, then learners show their executions, transcripts and scorecards</w:t>
+            </w:r>
+          </w:p>
+        </w:tc>
+        <w:tc>
+          <w:tcPr>
+            <w:tcW w:type="dxa" w:w="1728"/>
+          </w:tcPr>
+          <w:p>
+            <w:r>
+              <w:t>-</w:t>
+            </w:r>
+          </w:p>
+        </w:tc>
+        <w:tc>
+          <w:tcPr>
+            <w:tcW w:type="dxa" w:w="1728"/>
+          </w:tcPr>
+          <w:p>
+            <w:r>
+              <w:t>Trainer sign-off on the day's evidence</w:t>
+            </w:r>
+          </w:p>
+        </w:tc>
+      </w:tr>
+    </w:tbl>
+    <w:p/>
+    <w:p>
+      <w:r>
+        <w:t>Day 1 instructional time: 7h 30m (9:30am-5:30pm, less a 30-minute lunch).</w:t>
+      </w:r>
+    </w:p>
+    <w:p/>
+    <w:p>
+      <w:pPr>
+        <w:pStyle w:val="Heading2"/>
+      </w:pPr>
+      <w:r>
+        <w:t>Day 2</w:t>
+      </w:r>
+    </w:p>
+    <w:p/>
+    <w:tbl>
+      <w:tblPr>
+        <w:tblStyle w:val="LightGrid-Accent1"/>
+        <w:tblW w:type="auto" w:w="0"/>
+        <w:tblLook w:firstColumn="1" w:firstRow="1" w:lastColumn="0" w:lastRow="0" w:noHBand="0" w:noVBand="1" w:val="04A0"/>
+      </w:tblPr>
+      <w:tblGrid>
+        <w:gridCol w:w="1728"/>
+        <w:gridCol w:w="1728"/>
+        <w:gridCol w:w="1728"/>
+        <w:gridCol w:w="1728"/>
+        <w:gridCol w:w="1728"/>
+      </w:tblGrid>
+      <w:tr>
+        <w:tc>
+          <w:tcPr>
+            <w:tcW w:type="dxa" w:w="1728"/>
+          </w:tcPr>
+          <w:p>
+            <w:r>
+              <w:t>Time</w:t>
+            </w:r>
+          </w:p>
+        </w:tc>
+        <w:tc>
+          <w:tcPr>
+            <w:tcW w:type="dxa" w:w="1728"/>
+          </w:tcPr>
+          <w:p>
+            <w:r>
+              <w:t>Duration</w:t>
+            </w:r>
+          </w:p>
+        </w:tc>
+        <w:tc>
+          <w:tcPr>
+            <w:tcW w:type="dxa" w:w="1728"/>
+          </w:tcPr>
+          <w:p>
+            <w:r>
+              <w:t>Topic / Activity</w:t>
+            </w:r>
+          </w:p>
+        </w:tc>
+        <w:tc>
+          <w:tcPr>
+            <w:tcW w:type="dxa" w:w="1728"/>
+          </w:tcPr>
+          <w:p>
+            <w:r>
+              <w:t>Deck</w:t>
+            </w:r>
+          </w:p>
+        </w:tc>
+        <w:tc>
+          <w:tcPr>
+            <w:tcW w:type="dxa" w:w="1728"/>
+          </w:tcPr>
+          <w:p>
+            <w:r>
+              <w:t>Evidence produced</w:t>
+            </w:r>
+          </w:p>
+        </w:tc>
+      </w:tr>
+      <w:tr>
+        <w:tc>
+          <w:tcPr>
+            <w:tcW w:type="dxa" w:w="1728"/>
+          </w:tcPr>
+          <w:p>
+            <w:r>
+              <w:t>9:30am - 10:45am</w:t>
+            </w:r>
+          </w:p>
+        </w:tc>
+        <w:tc>
+          <w:tcPr>
+            <w:tcW w:type="dxa" w:w="1728"/>
+          </w:tcPr>
+          <w:p>
+            <w:r>
+              <w:t>75 min</w:t>
+            </w:r>
+          </w:p>
+        </w:tc>
+        <w:tc>
+          <w:tcPr>
+            <w:tcW w:type="dxa" w:w="1728"/>
+          </w:tcPr>
+          <w:p>
+            <w:r>
+              <w:t>Lab 6 - Lip-Sync Face-Off: MuseTalk vs HeyGen</w:t>
+            </w:r>
+          </w:p>
+        </w:tc>
+        <w:tc>
+          <w:tcPr>
+            <w:tcW w:type="dxa" w:w="1728"/>
+          </w:tcPr>
+          <w:p>
+            <w:r>
+              <w:t>Slide 68</w:t>
+            </w:r>
+          </w:p>
+        </w:tc>
+        <w:tc>
+          <w:tcPr>
+            <w:tcW w:type="dxa" w:w="1728"/>
+          </w:tcPr>
+          <w:p>
+            <w:r>
+              <w:t>Two rendered clips of one script, a scored comparison, and a one-line recommendation per engine.</w:t>
+            </w:r>
+          </w:p>
+        </w:tc>
+      </w:tr>
+      <w:tr>
+        <w:tc>
+          <w:tcPr>
+            <w:tcW w:type="dxa" w:w="1728"/>
+          </w:tcPr>
+          <w:p>
+            <w:r>
+              <w:t>10:45am - 11:45am</w:t>
+            </w:r>
+          </w:p>
+        </w:tc>
+        <w:tc>
+          <w:tcPr>
+            <w:tcW w:type="dxa" w:w="1728"/>
+          </w:tcPr>
+          <w:p>
+            <w:r>
+              <w:t>60 min</w:t>
+            </w:r>
+          </w:p>
+        </w:tc>
+        <w:tc>
+          <w:tcPr>
+            <w:tcW w:type="dxa" w:w="1728"/>
+          </w:tcPr>
+          <w:p>
+            <w:r>
+              <w:t>Lab 7 - Avatar News Video with HeyGen (GG News Studio)</w:t>
+            </w:r>
+          </w:p>
+        </w:tc>
+        <w:tc>
+          <w:tcPr>
+            <w:tcW w:type="dxa" w:w="1728"/>
+          </w:tcPr>
+          <w:p>
+            <w:r>
+              <w:t>Slide 75</w:t>
+            </w:r>
+          </w:p>
+        </w:tc>
+        <w:tc>
+          <w:tcPr>
+            <w:tcW w:type="dxa" w:w="1728"/>
+          </w:tcPr>
+          <w:p>
+            <w:r>
+              <w:t>Your own news broadcast, played to the class, plus quality-review notes on the script and the render.</w:t>
+            </w:r>
+          </w:p>
+        </w:tc>
+      </w:tr>
+      <w:tr>
+        <w:tc>
+          <w:tcPr>
+            <w:tcW w:type="dxa" w:w="1728"/>
+          </w:tcPr>
+          <w:p>
+            <w:r>
+              <w:t>11:45am - 12:45pm</w:t>
+            </w:r>
+          </w:p>
+        </w:tc>
+        <w:tc>
+          <w:tcPr>
+            <w:tcW w:type="dxa" w:w="1728"/>
+          </w:tcPr>
+          <w:p>
+            <w:r>
+              <w:t>60 min</w:t>
+            </w:r>
+          </w:p>
+        </w:tc>
+        <w:tc>
+          <w:tcPr>
+            <w:tcW w:type="dxa" w:w="1728"/>
+          </w:tcPr>
+          <w:p>
+            <w:r>
+              <w:t>Lab 7-os - Open-Source News Avatar - Free and Local</w:t>
+            </w:r>
+          </w:p>
+        </w:tc>
+        <w:tc>
+          <w:tcPr>
+            <w:tcW w:type="dxa" w:w="1728"/>
+          </w:tcPr>
+          <w:p>
+            <w:r>
+              <w:t>Slide 81</w:t>
+            </w:r>
+          </w:p>
+        </w:tc>
+        <w:tc>
+          <w:tcPr>
+            <w:tcW w:type="dxa" w:w="1728"/>
+          </w:tcPr>
+          <w:p>
+            <w:r>
+              <w:t>A locally rendered news video and a written HeyGen-versus-local comparison.</w:t>
+            </w:r>
+          </w:p>
+        </w:tc>
+      </w:tr>
+      <w:tr>
+        <w:tc>
+          <w:tcPr>
+            <w:tcW w:type="dxa" w:w="1728"/>
+          </w:tcPr>
+          <w:p>
+            <w:r>
+              <w:t>12:45pm - 1:15pm</w:t>
+            </w:r>
+          </w:p>
+        </w:tc>
+        <w:tc>
+          <w:tcPr>
+            <w:tcW w:type="dxa" w:w="1728"/>
+          </w:tcPr>
+          <w:p>
+            <w:r>
+              <w:t>30 min</w:t>
+            </w:r>
+          </w:p>
+        </w:tc>
+        <w:tc>
+          <w:tcPr>
+            <w:tcW w:type="dxa" w:w="1728"/>
+          </w:tcPr>
+          <w:p>
+            <w:r>
+              <w:t>LUNCH</w:t>
+            </w:r>
+          </w:p>
+        </w:tc>
+        <w:tc>
+          <w:tcPr>
+            <w:tcW w:type="dxa" w:w="1728"/>
+          </w:tcPr>
+          <w:p>
+            <w:r>
+              <w:t>-</w:t>
+            </w:r>
+          </w:p>
+        </w:tc>
+        <w:tc>
+          <w:tcPr>
+            <w:tcW w:type="dxa" w:w="1728"/>
+          </w:tcPr>
+          <w:p>
+            <w:r>
+              <w:t>-</w:t>
+            </w:r>
+          </w:p>
+        </w:tc>
+      </w:tr>
+      <w:tr>
+        <w:tc>
+          <w:tcPr>
+            <w:tcW w:type="dxa" w:w="1728"/>
+          </w:tcPr>
+          <w:p>
+            <w:r>
+              <w:t>1:15pm - 2:15pm</w:t>
+            </w:r>
+          </w:p>
+        </w:tc>
+        <w:tc>
+          <w:tcPr>
+            <w:tcW w:type="dxa" w:w="1728"/>
+          </w:tcPr>
+          <w:p>
+            <w:r>
+              <w:t>60 min</w:t>
+            </w:r>
+          </w:p>
+        </w:tc>
+        <w:tc>
+          <w:tcPr>
+            <w:tcW w:type="dxa" w:w="1728"/>
+          </w:tcPr>
+          <w:p>
+            <w:r>
+              <w:t>Lab 8 - Interactive Avatar Brain (Aria, In-Browser)</w:t>
+            </w:r>
+          </w:p>
+        </w:tc>
+        <w:tc>
+          <w:tcPr>
+            <w:tcW w:type="dxa" w:w="1728"/>
+          </w:tcPr>
+          <w:p>
+            <w:r>
+              <w:t>Slide 87</w:t>
+            </w:r>
+          </w:p>
+        </w:tc>
+        <w:tc>
+          <w:tcPr>
+            <w:tcW w:type="dxa" w:w="1728"/>
+          </w:tcPr>
+          <w:p>
+            <w:r>
+              <w:t>A conversation with Aria, the latency-panel screenshot, and one prompt improvement you made and re-tested.</w:t>
+            </w:r>
+          </w:p>
+        </w:tc>
+      </w:tr>
+      <w:tr>
+        <w:tc>
+          <w:tcPr>
+            <w:tcW w:type="dxa" w:w="1728"/>
+          </w:tcPr>
+          <w:p>
+            <w:r>
+              <w:t>2:15pm - 3:15pm</w:t>
+            </w:r>
+          </w:p>
+        </w:tc>
+        <w:tc>
+          <w:tcPr>
+            <w:tcW w:type="dxa" w:w="1728"/>
+          </w:tcPr>
+          <w:p>
+            <w:r>
+              <w:t>60 min</w:t>
+            </w:r>
+          </w:p>
+        </w:tc>
+        <w:tc>
+          <w:tcPr>
+            <w:tcW w:type="dxa" w:w="1728"/>
+          </w:tcPr>
+          <w:p>
+            <w:r>
+              <w:t>Lab 9 - Interactive Avatar Session (Nova, HeyGen LiveAvatar)</w:t>
+            </w:r>
+          </w:p>
+        </w:tc>
+        <w:tc>
+          <w:tcPr>
+            <w:tcW w:type="dxa" w:w="1728"/>
+          </w:tcPr>
+          <w:p>
+            <w:r>
+              <w:t>Slide 93</w:t>
+            </w:r>
+          </w:p>
+        </w:tc>
+        <w:tc>
+          <w:tcPr>
+            <w:tcW w:type="dxa" w:w="1728"/>
+          </w:tcPr>
+          <w:p>
+            <w:r>
+              <w:t>A working Nova session plus the two-column scorecard comparing her against the browser-rendered avatar.</w:t>
+            </w:r>
+          </w:p>
+        </w:tc>
+      </w:tr>
+      <w:tr>
+        <w:tc>
+          <w:tcPr>
+            <w:tcW w:type="dxa" w:w="1728"/>
+          </w:tcPr>
+          <w:p>
+            <w:r>
+              <w:t>3:15pm - 4:30pm</w:t>
+            </w:r>
+          </w:p>
+        </w:tc>
+        <w:tc>
+          <w:tcPr>
+            <w:tcW w:type="dxa" w:w="1728"/>
+          </w:tcPr>
+          <w:p>
+            <w:r>
+              <w:t>75 min</w:t>
+            </w:r>
+          </w:p>
+        </w:tc>
+        <w:tc>
+          <w:tcPr>
+            <w:tcW w:type="dxa" w:w="1728"/>
+          </w:tcPr>
+          <w:p>
+            <w:r>
+              <w:t>Lab 10 - AI Video Generation with Gemini Veo 3 (Veo Studio)</w:t>
+            </w:r>
+          </w:p>
+        </w:tc>
+        <w:tc>
+          <w:tcPr>
+            <w:tcW w:type="dxa" w:w="1728"/>
+          </w:tcPr>
+          <w:p>
+            <w:r>
+              <w:t>Slide 99</w:t>
+            </w:r>
+          </w:p>
+        </w:tc>
+        <w:tc>
+          <w:tcPr>
+            <w:tcW w:type="dxa" w:w="1728"/>
+          </w:tcPr>
+          <w:p>
+            <w:r>
+              <w:t>Your own Veo clip presented to the class, the shot prompt that produced it, and a note on what changed between two prompt versions.</w:t>
+            </w:r>
+          </w:p>
+        </w:tc>
+      </w:tr>
+      <w:tr>
+        <w:tc>
+          <w:tcPr>
+            <w:tcW w:type="dxa" w:w="1728"/>
+          </w:tcPr>
+          <w:p>
+            <w:r>
+              <w:t>4:30pm - 5:30pm</w:t>
+            </w:r>
+          </w:p>
+        </w:tc>
+        <w:tc>
+          <w:tcPr>
+            <w:tcW w:type="dxa" w:w="1728"/>
+          </w:tcPr>
+          <w:p>
+            <w:r>
+              <w:t>60 min</w:t>
+            </w:r>
+          </w:p>
+        </w:tc>
+        <w:tc>
+          <w:tcPr>
+            <w:tcW w:type="dxa" w:w="1728"/>
+          </w:tcPr>
+          <w:p>
+            <w:r>
+              <w:t>Concept delivery, review, evidence check and course feedback - the trainer teaches the concept, workflow and quality slides for the day's labs, then learners show their executions, transcripts and scorecards</w:t>
+            </w:r>
+          </w:p>
+        </w:tc>
+        <w:tc>
+          <w:tcPr>
+            <w:tcW w:type="dxa" w:w="1728"/>
+          </w:tcPr>
+          <w:p>
+            <w:r>
+              <w:t>-</w:t>
+            </w:r>
+          </w:p>
+        </w:tc>
+        <w:tc>
+          <w:tcPr>
+            <w:tcW w:type="dxa" w:w="1728"/>
+          </w:tcPr>
+          <w:p>
+            <w:r>
+              <w:t>Trainer sign-off on the day's evidence</w:t>
+            </w:r>
+          </w:p>
+        </w:tc>
+      </w:tr>
+    </w:tbl>
+    <w:p/>
+    <w:p>
+      <w:r>
+        <w:t>Day 2 instructional time: 7h 30m (9:30am-5:30pm, less a 30-minute lunch).</w:t>
+      </w:r>
+    </w:p>
+    <w:p/>
+    <w:p/>
+    <w:p/>
+    <w:p/>
+    <w:p/>
+    <w:p>
+      <w:pPr>
+        <w:pStyle w:val="Heading1"/>
+      </w:pPr>
+      <w:r>
+        <w:t>Evidence the trainer collects</w:t>
+      </w:r>
+    </w:p>
+    <w:p/>
+    <w:p>
+      <w:pPr>
+        <w:pStyle w:val="ListBullet"/>
+      </w:pPr>
+      <w:r>
+        <w:t>Workflow exports and n8n execution traces for each lab.</w:t>
+      </w:r>
+    </w:p>
+    <w:p>
+      <w:pPr>
+        <w:pStyle w:val="ListBullet"/>
+      </w:pPr>
+      <w:r>
+        <w:t>The provoked failures: the RAG refusal (Lab 2), the course that does not exist (Lab 3), Ava's medical refusals (Lab 5).</w:t>
+      </w:r>
+    </w:p>
+    <w:p>
+      <w:pPr>
+        <w:pStyle w:val="ListBullet"/>
+      </w:pPr>
+      <w:r>
+        <w:t>The Google Calendar booking created by voice, with its call transcript (Lab 4).</w:t>
+      </w:r>
+    </w:p>
+    <w:p>
+      <w:pPr>
+        <w:pStyle w:val="ListBullet"/>
+      </w:pPr>
+      <w:r>
+        <w:t>The lip-sync comparison scorecard: MuseTalk vs HeyGen on one script (Lab 6).</w:t>
+      </w:r>
+    </w:p>
+    <w:p>
+      <w:pPr>
+        <w:pStyle w:val="ListBullet"/>
+      </w:pPr>
+      <w:r>
+        <w:t>Generated media: the news avatar videos (Labs 7 and 7-os), the Aria latency screenshot (Lab 8), the Nova session scorecard (Lab 9), the Veo clip and its shot prompt (Lab 10).</w:t>
+      </w:r>
+    </w:p>
     <w:sectPr>
-      <w:footerReference w:type="default" r:id="rId10"/>
+      <w:footerReference w:type="default" r:id="rId11"/>
+      <w:headerReference w:type="default" r:id="rId12"/>
       <w:pgSz w:w="12240" w:h="15840"/>
       <w:pgMar w:top="1440" w:right="1800" w:bottom="1440" w:left="1800" w:header="720" w:footer="720" w:gutter="0"/>
       <w:cols w:space="720"/>
@@ -2064,6 +2101,16 @@
     </w:r>
   </w:p>
 </w:ftr>
+</file>
+
+<file path=word/header1.xml><?xml version="1.0" encoding="utf-8"?>
+<w:hdr xmlns:m="http://schemas.openxmlformats.org/officeDocument/2006/math" xmlns:mc="http://schemas.openxmlformats.org/markup-compatibility/2006" xmlns:mo="http://schemas.microsoft.com/office/mac/office/2008/main" xmlns:mv="urn:schemas-microsoft-com:mac:vml" xmlns:o="urn:schemas-microsoft-com:office:office" xmlns:r="http://schemas.openxmlformats.org/officeDocument/2006/relationships" xmlns:v="urn:schemas-microsoft-com:vml" xmlns:w10="urn:schemas-microsoft-com:office:word" xmlns:w14="http://schemas.microsoft.com/office/word/2010/wordml" xmlns:w="http://schemas.openxmlformats.org/wordprocessingml/2006/main" xmlns:wne="http://schemas.microsoft.com/office/word/2006/wordml" xmlns:wp14="http://schemas.microsoft.com/office/word/2010/wordprocessingDrawing" xmlns:wp="http://schemas.openxmlformats.org/drawingml/2006/wordprocessingDrawing" xmlns:wpc="http://schemas.microsoft.com/office/word/2010/wordprocessingCanvas" xmlns:wpg="http://schemas.microsoft.com/office/word/2010/wordprocessingGroup" xmlns:wpi="http://schemas.microsoft.com/office/word/2010/wordprocessingInk" xmlns:wps="http://schemas.microsoft.com/office/word/2010/wordprocessingShape" mc:Ignorable="w14 wp14">
+  <w:p>
+    <w:pPr>
+      <w:pStyle w:val="Header"/>
+    </w:pPr>
+  </w:p>
+</w:hdr>
 </file>
 
 <file path=word/numbering.xml><?xml version="1.0" encoding="utf-8"?>

</xml_diff>